<commit_message>
Kodlarımızı, sistemimizi ve PÇ çıktılarını anlattığımız raporumuz (guncellendi ve PDF formatında yuklendi.)
</commit_message>
<xml_diff>
--- a/Rapor.docx
+++ b/Rapor.docx
@@ -1017,6 +1017,14 @@
                             <w:r>
                               <w:rPr>
                                 <w:color w:val="013BA6"/>
+                                <w:sz w:val="32"/>
+                                <w:szCs w:val="32"/>
+                              </w:rPr>
+                              <w:t xml:space="preserve"> </w:t>
+                            </w:r>
+                            <w:r>
+                              <w:rPr>
+                                <w:color w:val="013BA6"/>
                                 <w:sz w:val="28"/>
                                 <w:szCs w:val="28"/>
                               </w:rPr>
@@ -1200,6 +1208,14 @@
                       <w:r>
                         <w:rPr>
                           <w:color w:val="013BA6"/>
+                          <w:sz w:val="32"/>
+                          <w:szCs w:val="32"/>
+                        </w:rPr>
+                        <w:t xml:space="preserve"> </w:t>
+                      </w:r>
+                      <w:r>
+                        <w:rPr>
+                          <w:color w:val="013BA6"/>
                           <w:sz w:val="28"/>
                           <w:szCs w:val="28"/>
                         </w:rPr>
@@ -1430,7 +1446,7 @@
           <w:r>
             <w:fldChar w:fldCharType="separate"/>
           </w:r>
-          <w:hyperlink w:anchor="_Toc226046759" w:history="1">
+          <w:hyperlink w:anchor="_Toc226123573" w:history="1">
             <w:r>
               <w:rPr>
                 <w:rStyle w:val="Kpr"/>
@@ -1472,7 +1488,7 @@
               <w:rPr>
                 <w:webHidden/>
               </w:rPr>
-              <w:instrText xml:space="preserve"> PAGEREF _Toc226046759 \h </w:instrText>
+              <w:instrText xml:space="preserve"> PAGEREF _Toc226123573 \h </w:instrText>
             </w:r>
             <w:r>
               <w:rPr>
@@ -1511,7 +1527,7 @@
               <w:lang w:eastAsia="tr-TR"/>
             </w:rPr>
           </w:pPr>
-          <w:hyperlink w:anchor="_Toc226046760" w:history="1">
+          <w:hyperlink w:anchor="_Toc226123574" w:history="1">
             <w:r>
               <w:rPr>
                 <w:rStyle w:val="Kpr"/>
@@ -1553,7 +1569,7 @@
               <w:rPr>
                 <w:webHidden/>
               </w:rPr>
-              <w:instrText xml:space="preserve"> PAGEREF _Toc226046760 \h </w:instrText>
+              <w:instrText xml:space="preserve"> PAGEREF _Toc226123574 \h </w:instrText>
             </w:r>
             <w:r>
               <w:rPr>
@@ -1592,7 +1608,7 @@
               <w:lang w:eastAsia="tr-TR"/>
             </w:rPr>
           </w:pPr>
-          <w:hyperlink w:anchor="_Toc226046761" w:history="1">
+          <w:hyperlink w:anchor="_Toc226123575" w:history="1">
             <w:r>
               <w:rPr>
                 <w:rStyle w:val="Kpr"/>
@@ -1634,7 +1650,7 @@
               <w:rPr>
                 <w:webHidden/>
               </w:rPr>
-              <w:instrText xml:space="preserve"> PAGEREF _Toc226046761 \h </w:instrText>
+              <w:instrText xml:space="preserve"> PAGEREF _Toc226123575 \h </w:instrText>
             </w:r>
             <w:r>
               <w:rPr>
@@ -1672,7 +1688,7 @@
               <w:lang w:eastAsia="tr-TR"/>
             </w:rPr>
           </w:pPr>
-          <w:hyperlink w:anchor="_Toc226046762" w:history="1">
+          <w:hyperlink w:anchor="_Toc226123576" w:history="1">
             <w:r>
               <w:rPr>
                 <w:rStyle w:val="Kpr"/>
@@ -1698,7 +1714,7 @@
               <w:rPr>
                 <w:webHidden/>
               </w:rPr>
-              <w:instrText xml:space="preserve"> PAGEREF _Toc226046762 \h </w:instrText>
+              <w:instrText xml:space="preserve"> PAGEREF _Toc226123576 \h </w:instrText>
             </w:r>
             <w:r>
               <w:rPr>
@@ -1737,7 +1753,7 @@
               <w:lang w:eastAsia="tr-TR"/>
             </w:rPr>
           </w:pPr>
-          <w:hyperlink w:anchor="_Toc226046763" w:history="1">
+          <w:hyperlink w:anchor="_Toc226123577" w:history="1">
             <w:r>
               <w:rPr>
                 <w:rStyle w:val="Kpr"/>
@@ -1761,7 +1777,7 @@
                 <w:b/>
                 <w:bCs/>
               </w:rPr>
-              <w:t>Kullanılan Veri Yapıları: Opcode ve Symbol Table Tasarımı (PÇ1)</w:t>
+              <w:t>Kullanılan Veri Yapıları: Opcode ve Symbol Table Tasarımı</w:t>
             </w:r>
             <w:r>
               <w:rPr>
@@ -1779,7 +1795,7 @@
               <w:rPr>
                 <w:webHidden/>
               </w:rPr>
-              <w:instrText xml:space="preserve"> PAGEREF _Toc226046763 \h </w:instrText>
+              <w:instrText xml:space="preserve"> PAGEREF _Toc226123577 \h </w:instrText>
             </w:r>
             <w:r>
               <w:rPr>
@@ -1817,7 +1833,7 @@
               <w:lang w:eastAsia="tr-TR"/>
             </w:rPr>
           </w:pPr>
-          <w:hyperlink w:anchor="_Toc226046764" w:history="1">
+          <w:hyperlink w:anchor="_Toc226123578" w:history="1">
             <w:r>
               <w:rPr>
                 <w:rStyle w:val="Kpr"/>
@@ -1843,7 +1859,7 @@
               <w:rPr>
                 <w:webHidden/>
               </w:rPr>
-              <w:instrText xml:space="preserve"> PAGEREF _Toc226046764 \h </w:instrText>
+              <w:instrText xml:space="preserve"> PAGEREF _Toc226123578 \h </w:instrText>
             </w:r>
             <w:r>
               <w:rPr>
@@ -1881,7 +1897,7 @@
               <w:lang w:eastAsia="tr-TR"/>
             </w:rPr>
           </w:pPr>
-          <w:hyperlink w:anchor="_Toc226046765" w:history="1">
+          <w:hyperlink w:anchor="_Toc226123579" w:history="1">
             <w:r>
               <w:rPr>
                 <w:rStyle w:val="Kpr"/>
@@ -1907,7 +1923,7 @@
               <w:rPr>
                 <w:webHidden/>
               </w:rPr>
-              <w:instrText xml:space="preserve"> PAGEREF _Toc226046765 \h </w:instrText>
+              <w:instrText xml:space="preserve"> PAGEREF _Toc226123579 \h </w:instrText>
             </w:r>
             <w:r>
               <w:rPr>
@@ -1946,7 +1962,7 @@
               <w:lang w:eastAsia="tr-TR"/>
             </w:rPr>
           </w:pPr>
-          <w:hyperlink w:anchor="_Toc226046766" w:history="1">
+          <w:hyperlink w:anchor="_Toc226123580" w:history="1">
             <w:r>
               <w:rPr>
                 <w:rStyle w:val="Kpr"/>
@@ -1988,7 +2004,7 @@
               <w:rPr>
                 <w:webHidden/>
               </w:rPr>
-              <w:instrText xml:space="preserve"> PAGEREF _Toc226046766 \h </w:instrText>
+              <w:instrText xml:space="preserve"> PAGEREF _Toc226123580 \h </w:instrText>
             </w:r>
             <w:r>
               <w:rPr>
@@ -2026,7 +2042,7 @@
               <w:lang w:eastAsia="tr-TR"/>
             </w:rPr>
           </w:pPr>
-          <w:hyperlink w:anchor="_Toc226046767" w:history="1">
+          <w:hyperlink w:anchor="_Toc226123581" w:history="1">
             <w:r>
               <w:rPr>
                 <w:rStyle w:val="Kpr"/>
@@ -2052,7 +2068,7 @@
               <w:rPr>
                 <w:webHidden/>
               </w:rPr>
-              <w:instrText xml:space="preserve"> PAGEREF _Toc226046767 \h </w:instrText>
+              <w:instrText xml:space="preserve"> PAGEREF _Toc226123581 \h </w:instrText>
             </w:r>
             <w:r>
               <w:rPr>
@@ -2090,7 +2106,7 @@
               <w:lang w:eastAsia="tr-TR"/>
             </w:rPr>
           </w:pPr>
-          <w:hyperlink w:anchor="_Toc226046768" w:history="1">
+          <w:hyperlink w:anchor="_Toc226123582" w:history="1">
             <w:r>
               <w:rPr>
                 <w:rStyle w:val="Kpr"/>
@@ -2116,7 +2132,7 @@
               <w:rPr>
                 <w:webHidden/>
               </w:rPr>
-              <w:instrText xml:space="preserve"> PAGEREF _Toc226046768 \h </w:instrText>
+              <w:instrText xml:space="preserve"> PAGEREF _Toc226123582 \h </w:instrText>
             </w:r>
             <w:r>
               <w:rPr>
@@ -2154,7 +2170,7 @@
               <w:lang w:eastAsia="tr-TR"/>
             </w:rPr>
           </w:pPr>
-          <w:hyperlink w:anchor="_Toc226046769" w:history="1">
+          <w:hyperlink w:anchor="_Toc226123583" w:history="1">
             <w:r>
               <w:rPr>
                 <w:rStyle w:val="Kpr"/>
@@ -2180,7 +2196,7 @@
               <w:rPr>
                 <w:webHidden/>
               </w:rPr>
-              <w:instrText xml:space="preserve"> PAGEREF _Toc226046769 \h </w:instrText>
+              <w:instrText xml:space="preserve"> PAGEREF _Toc226123583 \h </w:instrText>
             </w:r>
             <w:r>
               <w:rPr>
@@ -2219,7 +2235,7 @@
               <w:lang w:eastAsia="tr-TR"/>
             </w:rPr>
           </w:pPr>
-          <w:hyperlink w:anchor="_Toc226046770" w:history="1">
+          <w:hyperlink w:anchor="_Toc226123584" w:history="1">
             <w:r>
               <w:rPr>
                 <w:rStyle w:val="Kpr"/>
@@ -2261,7 +2277,7 @@
               <w:rPr>
                 <w:webHidden/>
               </w:rPr>
-              <w:instrText xml:space="preserve"> PAGEREF _Toc226046770 \h </w:instrText>
+              <w:instrText xml:space="preserve"> PAGEREF _Toc226123584 \h </w:instrText>
             </w:r>
             <w:r>
               <w:rPr>
@@ -2299,7 +2315,7 @@
               <w:lang w:eastAsia="tr-TR"/>
             </w:rPr>
           </w:pPr>
-          <w:hyperlink w:anchor="_Toc226046771" w:history="1">
+          <w:hyperlink w:anchor="_Toc226123585" w:history="1">
             <w:r>
               <w:rPr>
                 <w:rStyle w:val="Kpr"/>
@@ -2325,7 +2341,7 @@
               <w:rPr>
                 <w:webHidden/>
               </w:rPr>
-              <w:instrText xml:space="preserve"> PAGEREF _Toc226046771 \h </w:instrText>
+              <w:instrText xml:space="preserve"> PAGEREF _Toc226123585 \h </w:instrText>
             </w:r>
             <w:r>
               <w:rPr>
@@ -2363,7 +2379,7 @@
               <w:lang w:eastAsia="tr-TR"/>
             </w:rPr>
           </w:pPr>
-          <w:hyperlink w:anchor="_Toc226046772" w:history="1">
+          <w:hyperlink w:anchor="_Toc226123586" w:history="1">
             <w:r>
               <w:rPr>
                 <w:rStyle w:val="Kpr"/>
@@ -2389,7 +2405,7 @@
               <w:rPr>
                 <w:webHidden/>
               </w:rPr>
-              <w:instrText xml:space="preserve"> PAGEREF _Toc226046772 \h </w:instrText>
+              <w:instrText xml:space="preserve"> PAGEREF _Toc226123586 \h </w:instrText>
             </w:r>
             <w:r>
               <w:rPr>
@@ -2428,7 +2444,7 @@
               <w:lang w:eastAsia="tr-TR"/>
             </w:rPr>
           </w:pPr>
-          <w:hyperlink w:anchor="_Toc226046773" w:history="1">
+          <w:hyperlink w:anchor="_Toc226123587" w:history="1">
             <w:r>
               <w:rPr>
                 <w:rStyle w:val="Kpr"/>
@@ -2470,7 +2486,7 @@
               <w:rPr>
                 <w:webHidden/>
               </w:rPr>
-              <w:instrText xml:space="preserve"> PAGEREF _Toc226046773 \h </w:instrText>
+              <w:instrText xml:space="preserve"> PAGEREF _Toc226123587 \h </w:instrText>
             </w:r>
             <w:r>
               <w:rPr>
@@ -2508,7 +2524,7 @@
               <w:lang w:eastAsia="tr-TR"/>
             </w:rPr>
           </w:pPr>
-          <w:hyperlink w:anchor="_Toc226046774" w:history="1">
+          <w:hyperlink w:anchor="_Toc226123588" w:history="1">
             <w:r>
               <w:rPr>
                 <w:rStyle w:val="Kpr"/>
@@ -2534,7 +2550,7 @@
               <w:rPr>
                 <w:webHidden/>
               </w:rPr>
-              <w:instrText xml:space="preserve"> PAGEREF _Toc226046774 \h </w:instrText>
+              <w:instrText xml:space="preserve"> PAGEREF _Toc226123588 \h </w:instrText>
             </w:r>
             <w:r>
               <w:rPr>
@@ -2572,7 +2588,7 @@
               <w:lang w:eastAsia="tr-TR"/>
             </w:rPr>
           </w:pPr>
-          <w:hyperlink w:anchor="_Toc226046775" w:history="1">
+          <w:hyperlink w:anchor="_Toc226123589" w:history="1">
             <w:r>
               <w:rPr>
                 <w:rStyle w:val="Kpr"/>
@@ -2598,7 +2614,7 @@
               <w:rPr>
                 <w:webHidden/>
               </w:rPr>
-              <w:instrText xml:space="preserve"> PAGEREF _Toc226046775 \h </w:instrText>
+              <w:instrText xml:space="preserve"> PAGEREF _Toc226123589 \h </w:instrText>
             </w:r>
             <w:r>
               <w:rPr>
@@ -2636,7 +2652,7 @@
               <w:lang w:eastAsia="tr-TR"/>
             </w:rPr>
           </w:pPr>
-          <w:hyperlink w:anchor="_Toc226046776" w:history="1">
+          <w:hyperlink w:anchor="_Toc226123590" w:history="1">
             <w:r>
               <w:rPr>
                 <w:rStyle w:val="Kpr"/>
@@ -2678,7 +2694,7 @@
               <w:rPr>
                 <w:webHidden/>
               </w:rPr>
-              <w:instrText xml:space="preserve"> PAGEREF _Toc226046776 \h </w:instrText>
+              <w:instrText xml:space="preserve"> PAGEREF _Toc226123590 \h </w:instrText>
             </w:r>
             <w:r>
               <w:rPr>
@@ -2716,7 +2732,7 @@
               <w:lang w:eastAsia="tr-TR"/>
             </w:rPr>
           </w:pPr>
-          <w:hyperlink w:anchor="_Toc226046777" w:history="1">
+          <w:hyperlink w:anchor="_Toc226123591" w:history="1">
             <w:r>
               <w:rPr>
                 <w:rStyle w:val="Kpr"/>
@@ -2742,7 +2758,7 @@
               <w:rPr>
                 <w:webHidden/>
               </w:rPr>
-              <w:instrText xml:space="preserve"> PAGEREF _Toc226046777 \h </w:instrText>
+              <w:instrText xml:space="preserve"> PAGEREF _Toc226123591 \h </w:instrText>
             </w:r>
             <w:r>
               <w:rPr>
@@ -2759,7 +2775,7 @@
               <w:rPr>
                 <w:webHidden/>
               </w:rPr>
-              <w:t>13</w:t>
+              <w:t>14</w:t>
             </w:r>
             <w:r>
               <w:rPr>
@@ -2780,7 +2796,7 @@
               <w:lang w:eastAsia="tr-TR"/>
             </w:rPr>
           </w:pPr>
-          <w:hyperlink w:anchor="_Toc226046778" w:history="1">
+          <w:hyperlink w:anchor="_Toc226123592" w:history="1">
             <w:r>
               <w:rPr>
                 <w:rStyle w:val="Kpr"/>
@@ -2806,7 +2822,7 @@
               <w:rPr>
                 <w:webHidden/>
               </w:rPr>
-              <w:instrText xml:space="preserve"> PAGEREF _Toc226046778 \h </w:instrText>
+              <w:instrText xml:space="preserve"> PAGEREF _Toc226123592 \h </w:instrText>
             </w:r>
             <w:r>
               <w:rPr>
@@ -2941,7 +2957,7 @@
           <w:szCs w:val="24"/>
         </w:rPr>
       </w:pPr>
-      <w:bookmarkStart w:id="0" w:name="_Toc226046759"/>
+      <w:bookmarkStart w:id="0" w:name="_Toc226123573"/>
       <w:r>
         <w:rPr>
           <w:rFonts w:ascii="Courier New" w:eastAsiaTheme="minorHAnsi" w:hAnsi="Courier New" w:cs="Courier New"/>
@@ -2958,6 +2974,7 @@
     <w:p>
       <w:pPr>
         <w:spacing w:line="276" w:lineRule="auto"/>
+        <w:ind w:firstLine="360"/>
         <w:jc w:val="both"/>
         <w:rPr>
           <w:rFonts w:ascii="Courier New" w:hAnsi="Courier New" w:cs="Courier New"/>
@@ -2990,7 +3007,7 @@
           <w:szCs w:val="24"/>
         </w:rPr>
       </w:pPr>
-      <w:bookmarkStart w:id="1" w:name="_Toc226046760"/>
+      <w:bookmarkStart w:id="1" w:name="_Toc226123574"/>
       <w:r>
         <w:rPr>
           <w:rFonts w:ascii="Courier New" w:eastAsiaTheme="minorHAnsi" w:hAnsi="Courier New" w:cs="Courier New"/>
@@ -3018,6 +3035,7 @@
     <w:p>
       <w:pPr>
         <w:spacing w:line="276" w:lineRule="auto"/>
+        <w:ind w:firstLine="360"/>
         <w:jc w:val="both"/>
         <w:rPr>
           <w:rFonts w:ascii="Courier New" w:hAnsi="Courier New" w:cs="Courier New"/>
@@ -3037,6 +3055,7 @@
     <w:p>
       <w:pPr>
         <w:spacing w:line="276" w:lineRule="auto"/>
+        <w:ind w:firstLine="360"/>
         <w:jc w:val="both"/>
         <w:rPr>
           <w:rFonts w:ascii="Courier New" w:hAnsi="Courier New" w:cs="Courier New"/>
@@ -3056,6 +3075,7 @@
     <w:p>
       <w:pPr>
         <w:spacing w:line="276" w:lineRule="auto"/>
+        <w:ind w:firstLine="360"/>
         <w:jc w:val="both"/>
         <w:rPr>
           <w:rFonts w:ascii="Courier New" w:hAnsi="Courier New" w:cs="Courier New"/>
@@ -3069,7 +3089,7 @@
           <w:sz w:val="20"/>
           <w:szCs w:val="20"/>
         </w:rPr>
-        <w:t>Projenin donanımsal altyapısını oluşturan makine kodu üretim algoritmaları, doğrudan RISC-V International tarafından yayımlanan resmi yönergelere dayanmaktadır. "The RISC-V Instruction Set Manual" dokümanında belirtilen RV32I Temel Tam Sayı Komut Seti spesifikasyonlarına göre, işlemcinin komut çözme (decoding) donanımını basitleştirmek amacıyla tüm komutlar 32-bit sabit uzunluktadır [3]. Geliştirilen yazılımdaki R, I, S ve B komut formatlarının bit kaydırma (bitwise shift) mantığı, negatif offset değerlerinin 2'ye tümleyen (two's complement) formunda işlenmesi ve program sayacı göreli (PC-</w:t>
+        <w:t xml:space="preserve">Projenin donanımsal altyapısını oluşturan makine kodu üretim algoritmaları, doğrudan RISC-V International tarafından yayımlanan resmi yönergelere dayanmaktadır. "The RISC-V Instruction Set Manual" dokümanında belirtilen RV32I Temel Tam Sayı Komut Seti spesifikasyonlarına göre, işlemcinin komut çözme (decoding) donanımını basitleştirmek amacıyla tüm komutlar 32-bit sabit uzunluktadır [3]. Geliştirilen yazılımdaki R, I, S ve B komut formatlarının bit kaydırma (bitwise shift) mantığı, negatif offset değerlerinin 2'ye tümleyen (two's complement) formunda işlenmesi ve program </w:t>
       </w:r>
       <w:r>
         <w:rPr>
@@ -3078,12 +3098,13 @@
           <w:szCs w:val="20"/>
         </w:rPr>
         <w:lastRenderedPageBreak/>
-        <w:t>relative) adresleme hesaplamaları tamamen bu resmi literatür kurallarına uygun olarak kodlanmıştır.</w:t>
+        <w:t>sayacı göreli (PC-relative) adresleme hesaplamaları tamamen bu resmi literatür kurallarına uygun olarak kodlanmıştır.</w:t>
       </w:r>
     </w:p>
     <w:p>
       <w:pPr>
         <w:spacing w:line="276" w:lineRule="auto"/>
+        <w:ind w:firstLine="360"/>
         <w:jc w:val="both"/>
         <w:rPr>
           <w:rFonts w:ascii="Courier New" w:hAnsi="Courier New" w:cs="Courier New"/>
@@ -3116,7 +3137,7 @@
           <w:szCs w:val="24"/>
         </w:rPr>
       </w:pPr>
-      <w:bookmarkStart w:id="2" w:name="_Toc226046761"/>
+      <w:bookmarkStart w:id="2" w:name="_Toc226123575"/>
       <w:r>
         <w:rPr>
           <w:rFonts w:ascii="Courier New" w:eastAsiaTheme="minorHAnsi" w:hAnsi="Courier New" w:cs="Courier New"/>
@@ -3166,6 +3187,7 @@
     <w:p>
       <w:pPr>
         <w:spacing w:line="276" w:lineRule="auto"/>
+        <w:ind w:firstLine="360"/>
         <w:jc w:val="both"/>
         <w:rPr>
           <w:rFonts w:ascii="Courier New" w:hAnsi="Courier New" w:cs="Courier New"/>
@@ -3185,6 +3207,7 @@
     <w:p>
       <w:pPr>
         <w:pStyle w:val="Balk2"/>
+        <w:ind w:firstLine="708"/>
         <w:rPr>
           <w:rFonts w:ascii="Courier New" w:eastAsiaTheme="minorHAnsi" w:hAnsi="Courier New" w:cs="Courier New"/>
           <w:b/>
@@ -3194,7 +3217,7 @@
           <w:szCs w:val="24"/>
         </w:rPr>
       </w:pPr>
-      <w:bookmarkStart w:id="3" w:name="_Toc226046762"/>
+      <w:bookmarkStart w:id="3" w:name="_Toc226123576"/>
       <w:r>
         <w:rPr>
           <w:rFonts w:ascii="Courier New" w:eastAsiaTheme="minorHAnsi" w:hAnsi="Courier New" w:cs="Courier New"/>
@@ -3222,6 +3245,7 @@
     <w:p>
       <w:pPr>
         <w:spacing w:line="276" w:lineRule="auto"/>
+        <w:ind w:firstLine="708"/>
         <w:jc w:val="both"/>
         <w:rPr>
           <w:rFonts w:ascii="Courier New" w:hAnsi="Courier New" w:cs="Courier New"/>
@@ -3284,17 +3308,13 @@
     </w:p>
     <w:p>
       <w:pPr>
+        <w:keepNext/>
         <w:jc w:val="both"/>
-        <w:rPr>
-          <w:rFonts w:ascii="Courier New" w:hAnsi="Courier New" w:cs="Courier New"/>
-          <w:sz w:val="20"/>
-          <w:szCs w:val="20"/>
-        </w:rPr>
       </w:pPr>
       <w:r>
         <w:lastRenderedPageBreak/>
         <w:drawing>
-          <wp:inline distT="0" distB="0" distL="0" distR="0" wp14:anchorId="293ECA97" wp14:editId="68EED68C">
+          <wp:inline distT="0" distB="0" distL="0" distR="0" wp14:anchorId="293ECA97" wp14:editId="6029AA96">
             <wp:extent cx="5611091" cy="6885121"/>
             <wp:effectExtent l="0" t="0" r="8890" b="0"/>
             <wp:docPr id="865666636" name="Resim 8"/>
@@ -3347,6 +3367,39 @@
     </w:p>
     <w:p>
       <w:pPr>
+        <w:pStyle w:val="ResimYazs"/>
+        <w:ind w:left="2832" w:firstLine="708"/>
+        <w:jc w:val="both"/>
+        <w:rPr>
+          <w:rFonts w:ascii="Courier New" w:hAnsi="Courier New" w:cs="Courier New"/>
+          <w:sz w:val="20"/>
+          <w:szCs w:val="20"/>
+        </w:rPr>
+      </w:pPr>
+      <w:r>
+        <w:t xml:space="preserve">Şekil </w:t>
+      </w:r>
+      <w:r>
+        <w:fldChar w:fldCharType="begin"/>
+      </w:r>
+      <w:r>
+        <w:instrText xml:space="preserve"> SEQ Şekil \* ARABIC </w:instrText>
+      </w:r>
+      <w:r>
+        <w:fldChar w:fldCharType="separate"/>
+      </w:r>
+      <w:r>
+        <w:t>1</w:t>
+      </w:r>
+      <w:r>
+        <w:fldChar w:fldCharType="end"/>
+      </w:r>
+      <w:r>
+        <w:t xml:space="preserve"> Pass1 Akış Şeması</w:t>
+      </w:r>
+    </w:p>
+    <w:p>
+      <w:pPr>
         <w:spacing w:line="276" w:lineRule="auto"/>
         <w:jc w:val="both"/>
         <w:rPr>
@@ -3383,26 +3436,16 @@
           <w:szCs w:val="20"/>
         </w:rPr>
       </w:pPr>
-    </w:p>
-    <w:p>
-      <w:pPr>
-        <w:jc w:val="both"/>
-        <w:rPr>
-          <w:rFonts w:ascii="Courier New" w:hAnsi="Courier New" w:cs="Courier New"/>
-          <w:sz w:val="20"/>
-          <w:szCs w:val="20"/>
-        </w:rPr>
-      </w:pPr>
       <w:r>
         <w:lastRenderedPageBreak/>
         <w:drawing>
-          <wp:anchor distT="0" distB="0" distL="114300" distR="114300" simplePos="0" relativeHeight="251670528" behindDoc="0" locked="0" layoutInCell="1" allowOverlap="1" wp14:anchorId="01F6E2F3" wp14:editId="358DEE37">
+          <wp:anchor distT="0" distB="0" distL="114300" distR="114300" simplePos="0" relativeHeight="251670528" behindDoc="0" locked="0" layoutInCell="1" allowOverlap="1" wp14:anchorId="01F6E2F3" wp14:editId="65CB90AB">
             <wp:simplePos x="0" y="0"/>
             <wp:positionH relativeFrom="column">
-              <wp:posOffset>-839470</wp:posOffset>
+              <wp:posOffset>-847302</wp:posOffset>
             </wp:positionH>
             <wp:positionV relativeFrom="paragraph">
-              <wp:posOffset>-772160</wp:posOffset>
+              <wp:posOffset>-870162</wp:posOffset>
             </wp:positionV>
             <wp:extent cx="7402195" cy="5599430"/>
             <wp:effectExtent l="0" t="0" r="8255" b="1270"/>
@@ -3630,6 +3673,138 @@
           <w:szCs w:val="20"/>
         </w:rPr>
       </w:pPr>
+      <w:r>
+        <mc:AlternateContent>
+          <mc:Choice Requires="wps">
+            <w:drawing>
+              <wp:anchor distT="0" distB="0" distL="114300" distR="114300" simplePos="0" relativeHeight="251673600" behindDoc="0" locked="0" layoutInCell="1" allowOverlap="1" wp14:anchorId="4C46EC5B" wp14:editId="17ADC2D9">
+                <wp:simplePos x="0" y="0"/>
+                <wp:positionH relativeFrom="column">
+                  <wp:posOffset>-847937</wp:posOffset>
+                </wp:positionH>
+                <wp:positionV relativeFrom="paragraph">
+                  <wp:posOffset>325755</wp:posOffset>
+                </wp:positionV>
+                <wp:extent cx="7402195" cy="635"/>
+                <wp:effectExtent l="0" t="0" r="0" b="0"/>
+                <wp:wrapNone/>
+                <wp:docPr id="1632167956" name="Metin Kutusu 1"/>
+                <wp:cNvGraphicFramePr/>
+                <a:graphic xmlns:a="http://schemas.openxmlformats.org/drawingml/2006/main">
+                  <a:graphicData uri="http://schemas.microsoft.com/office/word/2010/wordprocessingShape">
+                    <wps:wsp>
+                      <wps:cNvSpPr txBox="1"/>
+                      <wps:spPr>
+                        <a:xfrm>
+                          <a:off x="0" y="0"/>
+                          <a:ext cx="7402195" cy="635"/>
+                        </a:xfrm>
+                        <a:prstGeom prst="rect">
+                          <a:avLst/>
+                        </a:prstGeom>
+                        <a:solidFill>
+                          <a:prstClr val="white"/>
+                        </a:solidFill>
+                        <a:ln>
+                          <a:noFill/>
+                        </a:ln>
+                      </wps:spPr>
+                      <wps:txbx>
+                        <w:txbxContent>
+                          <w:p>
+                            <w:pPr>
+                              <w:pStyle w:val="ResimYazs"/>
+                              <w:jc w:val="center"/>
+                            </w:pPr>
+                            <w:r>
+                              <w:t xml:space="preserve">Şekil </w:t>
+                            </w:r>
+                            <w:r>
+                              <w:fldChar w:fldCharType="begin"/>
+                            </w:r>
+                            <w:r>
+                              <w:instrText xml:space="preserve"> SEQ Şekil \* ARABIC </w:instrText>
+                            </w:r>
+                            <w:r>
+                              <w:fldChar w:fldCharType="separate"/>
+                            </w:r>
+                            <w:r>
+                              <w:t>2</w:t>
+                            </w:r>
+                            <w:r>
+                              <w:fldChar w:fldCharType="end"/>
+                            </w:r>
+                            <w:r>
+                              <w:t xml:space="preserve"> Pass2 Akış Şeması</w:t>
+                            </w:r>
+                          </w:p>
+                        </w:txbxContent>
+                      </wps:txbx>
+                      <wps:bodyPr rot="0" spcFirstLastPara="0" vertOverflow="overflow" horzOverflow="overflow" vert="horz" wrap="square" lIns="0" tIns="0" rIns="0" bIns="0" numCol="1" spcCol="0" rtlCol="0" fromWordArt="0" anchor="t" anchorCtr="0" forceAA="0" compatLnSpc="1">
+                        <a:prstTxWarp prst="textNoShape">
+                          <a:avLst/>
+                        </a:prstTxWarp>
+                        <a:spAutoFit/>
+                      </wps:bodyPr>
+                    </wps:wsp>
+                  </a:graphicData>
+                </a:graphic>
+              </wp:anchor>
+            </w:drawing>
+          </mc:Choice>
+          <mc:Fallback>
+            <w:pict>
+              <v:shapetype w14:anchorId="4C46EC5B" id="_x0000_t202" coordsize="21600,21600" o:spt="202" path="m,l,21600r21600,l21600,xe">
+                <v:stroke joinstyle="miter"/>
+                <v:path gradientshapeok="t" o:connecttype="rect"/>
+              </v:shapetype>
+              <v:shape id="Metin Kutusu 1" o:spid="_x0000_s1031" type="#_x0000_t202" style="position:absolute;left:0;text-align:left;margin-left:-66.75pt;margin-top:25.65pt;width:582.85pt;height:.05pt;z-index:251673600;visibility:visible;mso-wrap-style:square;mso-wrap-distance-left:9pt;mso-wrap-distance-top:0;mso-wrap-distance-right:9pt;mso-wrap-distance-bottom:0;mso-position-horizontal:absolute;mso-position-horizontal-relative:text;mso-position-vertical:absolute;mso-position-vertical-relative:text;v-text-anchor:top" o:gfxdata="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" stroked="f">
+                <v:textbox style="mso-fit-shape-to-text:t" inset="0,0,0,0">
+                  <w:txbxContent>
+                    <w:p>
+                      <w:pPr>
+                        <w:pStyle w:val="ResimYazs"/>
+                        <w:jc w:val="center"/>
+                      </w:pPr>
+                      <w:r>
+                        <w:t xml:space="preserve">Şekil </w:t>
+                      </w:r>
+                      <w:r>
+                        <w:fldChar w:fldCharType="begin"/>
+                      </w:r>
+                      <w:r>
+                        <w:instrText xml:space="preserve"> SEQ Şekil \* ARABIC </w:instrText>
+                      </w:r>
+                      <w:r>
+                        <w:fldChar w:fldCharType="separate"/>
+                      </w:r>
+                      <w:r>
+                        <w:t>2</w:t>
+                      </w:r>
+                      <w:r>
+                        <w:fldChar w:fldCharType="end"/>
+                      </w:r>
+                      <w:r>
+                        <w:t xml:space="preserve"> Pass2 Akış Şeması</w:t>
+                      </w:r>
+                    </w:p>
+                  </w:txbxContent>
+                </v:textbox>
+              </v:shape>
+            </w:pict>
+          </mc:Fallback>
+        </mc:AlternateContent>
+      </w:r>
+    </w:p>
+    <w:p>
+      <w:pPr>
+        <w:jc w:val="both"/>
+        <w:rPr>
+          <w:rFonts w:ascii="Courier New" w:hAnsi="Courier New" w:cs="Courier New"/>
+          <w:sz w:val="20"/>
+          <w:szCs w:val="20"/>
+        </w:rPr>
+      </w:pPr>
     </w:p>
     <w:p>
       <w:pPr>
@@ -3647,7 +3822,7 @@
           <w:szCs w:val="24"/>
         </w:rPr>
       </w:pPr>
-      <w:bookmarkStart w:id="4" w:name="_Toc226046763"/>
+      <w:bookmarkStart w:id="4" w:name="_Toc226123577"/>
       <w:r>
         <w:rPr>
           <w:rFonts w:ascii="Courier New" w:eastAsiaTheme="minorHAnsi" w:hAnsi="Courier New" w:cs="Courier New"/>
@@ -3659,6 +3834,7 @@
         </w:rPr>
         <w:t>Kullanılan Veri Yapıları: Opcode ve Symbol Table Tasarımı</w:t>
       </w:r>
+      <w:bookmarkEnd w:id="4"/>
       <w:r>
         <w:rPr>
           <w:rFonts w:ascii="Courier New" w:eastAsiaTheme="minorHAnsi" w:hAnsi="Courier New" w:cs="Courier New"/>
@@ -3670,7 +3846,31 @@
         </w:rPr>
         <w:t xml:space="preserve"> </w:t>
       </w:r>
-      <w:r>
+    </w:p>
+    <w:p>
+      <w:pPr>
+        <w:spacing w:line="276" w:lineRule="auto"/>
+        <w:ind w:firstLine="360"/>
+        <w:jc w:val="both"/>
+        <w:rPr>
+          <w:rFonts w:ascii="Courier New" w:hAnsi="Courier New" w:cs="Courier New"/>
+          <w:sz w:val="20"/>
+          <w:szCs w:val="20"/>
+        </w:rPr>
+      </w:pPr>
+      <w:r>
+        <w:rPr>
+          <w:rFonts w:ascii="Courier New" w:hAnsi="Courier New" w:cs="Courier New"/>
+          <w:sz w:val="20"/>
+          <w:szCs w:val="20"/>
+        </w:rPr>
+        <w:t>Assembler tasarımında, anımsatıcıların (mnemonics) makine diline çevrilmesi ve bellek adreslerinin yönetilmesi için etkin veri yapılarının kullanılması performans açısından kritik öneme sahiptir. İşlemciye ait komutların ve programcı tarafından tanımlanan etiketlerin (labels) doğrusal (linear) bir şekilde aranması, özellikle büyük ölçekli kaynak kodlarda işlem maliyetini O(n) seviyesine çıkararak derleme sürecini yavaşlatacaktır. Bu dar boğazı aşmak ve "Etkin ve optimize veri yapısı tasarımı" kriterini sağlamak amacıyla, projede Hash Table (Karma Tablosu) algoritmasını temel alan, C# diline özgü Dictionary &lt;TKey, TValue&gt; veri yapıları kullanılmıştır.</w:t>
+      </w:r>
+    </w:p>
+    <w:p>
+      <w:pPr>
+        <w:pStyle w:val="Balk2"/>
+        <w:ind w:firstLine="708"/>
         <w:rPr>
           <w:rFonts w:ascii="Courier New" w:eastAsiaTheme="minorHAnsi" w:hAnsi="Courier New" w:cs="Courier New"/>
           <w:b/>
@@ -3679,8 +3879,8 @@
           <w:sz w:val="24"/>
           <w:szCs w:val="24"/>
         </w:rPr>
-        <w:t>(PÇ</w:t>
-      </w:r>
+      </w:pPr>
+      <w:bookmarkStart w:id="5" w:name="_Toc226123578"/>
       <w:r>
         <w:rPr>
           <w:rFonts w:ascii="Courier New" w:eastAsiaTheme="minorHAnsi" w:hAnsi="Courier New" w:cs="Courier New"/>
@@ -3690,7 +3890,7 @@
           <w:sz w:val="24"/>
           <w:szCs w:val="24"/>
         </w:rPr>
-        <w:t>1</w:t>
+        <w:t xml:space="preserve">4.1. </w:t>
       </w:r>
       <w:r>
         <w:rPr>
@@ -3701,13 +3901,14 @@
           <w:sz w:val="24"/>
           <w:szCs w:val="24"/>
         </w:rPr>
-        <w:t>)</w:t>
-      </w:r>
-      <w:bookmarkEnd w:id="4"/>
+        <w:t>Opcode Tablosu (OPTAB) Tasarımı</w:t>
+      </w:r>
+      <w:bookmarkEnd w:id="5"/>
     </w:p>
     <w:p>
       <w:pPr>
         <w:spacing w:line="276" w:lineRule="auto"/>
+        <w:ind w:firstLine="708"/>
         <w:jc w:val="both"/>
         <w:rPr>
           <w:rFonts w:ascii="Courier New" w:hAnsi="Courier New" w:cs="Courier New"/>
@@ -3721,83 +3922,22 @@
           <w:sz w:val="20"/>
           <w:szCs w:val="20"/>
         </w:rPr>
-        <w:t>Assembler tasarımında, anımsatıcıların (mnemonics) makine diline çevrilmesi ve bellek adreslerinin yönetilmesi için etkin veri yapılarının kullanılması performans açısından kritik öneme sahiptir. İşlemciye ait komutların ve programcı tarafından tanımlanan etiketlerin (labels) doğrusal (linear) bir şekilde aranması, özellikle büyük ölçekli kaynak kodlarda işlem maliyetini O(n) seviyesine çıkararak derleme sürecini yavaşlatacaktır. Bu dar boğazı aşmak ve "Etkin ve optimize veri yapısı tasarımı" kriterini sağlamak amacıyla, projede Hash Table (Karma Tablosu) algoritmasını temel alan, C# diline özgü Dictionary &lt;TKey, TValue&gt; veri yapıları kullanılmıştır.</w:t>
-      </w:r>
-    </w:p>
-    <w:p>
-      <w:pPr>
-        <w:pStyle w:val="Balk2"/>
-        <w:ind w:firstLine="708"/>
-        <w:rPr>
-          <w:rFonts w:ascii="Courier New" w:eastAsiaTheme="minorHAnsi" w:hAnsi="Courier New" w:cs="Courier New"/>
-          <w:b/>
-          <w:bCs/>
-          <w:color w:val="auto"/>
-          <w:sz w:val="24"/>
-          <w:szCs w:val="24"/>
-        </w:rPr>
-      </w:pPr>
-      <w:bookmarkStart w:id="5" w:name="_Toc226046764"/>
-      <w:r>
-        <w:rPr>
-          <w:rFonts w:ascii="Courier New" w:eastAsiaTheme="minorHAnsi" w:hAnsi="Courier New" w:cs="Courier New"/>
-          <w:b/>
-          <w:bCs/>
-          <w:color w:val="auto"/>
-          <w:sz w:val="24"/>
-          <w:szCs w:val="24"/>
-        </w:rPr>
-        <w:t xml:space="preserve">4.1. </w:t>
-      </w:r>
-      <w:r>
-        <w:rPr>
-          <w:rFonts w:ascii="Courier New" w:eastAsiaTheme="minorHAnsi" w:hAnsi="Courier New" w:cs="Courier New"/>
-          <w:b/>
-          <w:bCs/>
-          <w:color w:val="auto"/>
-          <w:sz w:val="24"/>
-          <w:szCs w:val="24"/>
-        </w:rPr>
-        <w:t>Opcode Tablosu (OPTAB) Tasarımı</w:t>
-      </w:r>
-      <w:bookmarkEnd w:id="5"/>
-    </w:p>
-    <w:p>
-      <w:pPr>
-        <w:spacing w:line="276" w:lineRule="auto"/>
+        <w:t xml:space="preserve">Assembler, sadece anımsatıcının işlem kodunu makine diline dönüştürmekle kalmaz, aynı zamanda komut formatlarını (R, I, S, B) da bilmek zorundadır. Bu bağlamda, her bir komutun donanımsal özelliklerini (Format Tipi, Opcode, Funct3, Funct7) kapsülleyen (encapsulate) bir InstructionInfo sınıfı tasarlanmıştır. OpcodeTable veri yapısı, anımsatıcı string değerini (örneğin "add") anahtar (key) olarak alıp, ilgili InstructionInfo nesnesini değer (value) olarak döndüren statik bir Dictionary olarak gerçeklenmiştir. Bu yapı sayesinde, ayrıştırıcıdan (parser) gelen her bir komut için arama maliyeti O(1) (sabit zaman) karmaşıklığına indirilmiştir. Benzer şekilde, </w:t>
+      </w:r>
+      <w:r>
+        <w:rPr>
+          <w:rFonts w:ascii="Courier New" w:hAnsi="Courier New" w:cs="Courier New"/>
+          <w:sz w:val="20"/>
+          <w:szCs w:val="20"/>
+        </w:rPr>
+        <w:lastRenderedPageBreak/>
+        <w:t>register anımsatıcılarının (örneğin "x1", "sp") sayısal karşılıklarına dönüştürülmesi işlemi de ayrı bir O(1) erişimli sözlük üzerinden yürütülmektedir.</w:t>
+      </w:r>
+    </w:p>
+    <w:p>
+      <w:pPr>
+        <w:keepNext/>
         <w:jc w:val="both"/>
-        <w:rPr>
-          <w:rFonts w:ascii="Courier New" w:hAnsi="Courier New" w:cs="Courier New"/>
-          <w:sz w:val="20"/>
-          <w:szCs w:val="20"/>
-        </w:rPr>
-      </w:pPr>
-      <w:r>
-        <w:rPr>
-          <w:rFonts w:ascii="Courier New" w:hAnsi="Courier New" w:cs="Courier New"/>
-          <w:sz w:val="20"/>
-          <w:szCs w:val="20"/>
-        </w:rPr>
-        <w:t xml:space="preserve">Assembler, sadece anımsatıcının işlem kodunu makine diline dönüştürmekle kalmaz, aynı zamanda komut formatlarını (R, I, S, B) da bilmek zorundadır. Bu bağlamda, her bir komutun donanımsal özelliklerini (Format Tipi, Opcode, Funct3, Funct7) kapsülleyen (encapsulate) bir InstructionInfo sınıfı tasarlanmıştır. OpcodeTable veri yapısı, anımsatıcı string değerini (örneğin "add") anahtar (key) olarak alıp, ilgili InstructionInfo nesnesini değer (value) olarak döndüren statik bir Dictionary olarak gerçeklenmiştir. Bu yapı sayesinde, ayrıştırıcıdan (parser) gelen her bir komut için arama maliyeti O(1) (sabit zaman) karmaşıklığına indirilmiştir. Benzer şekilde, register </w:t>
-      </w:r>
-      <w:r>
-        <w:rPr>
-          <w:rFonts w:ascii="Courier New" w:hAnsi="Courier New" w:cs="Courier New"/>
-          <w:sz w:val="20"/>
-          <w:szCs w:val="20"/>
-        </w:rPr>
-        <w:lastRenderedPageBreak/>
-        <w:t>anımsatıcılarının (örneğin "x1", "sp") sayısal karşılıklarına dönüştürülmesi işlemi de ayrı bir O(1) erişimli sözlük üzerinden yürütülmektedir.</w:t>
-      </w:r>
-    </w:p>
-    <w:p>
-      <w:pPr>
-        <w:jc w:val="both"/>
-        <w:rPr>
-          <w:rFonts w:ascii="Courier New" w:hAnsi="Courier New" w:cs="Courier New"/>
-          <w:sz w:val="20"/>
-          <w:szCs w:val="20"/>
-        </w:rPr>
       </w:pPr>
       <w:r>
         <w:rPr>
@@ -3850,11 +3990,40 @@
     </w:p>
     <w:p>
       <w:pPr>
-        <w:rPr>
-          <w:rFonts w:ascii="Courier New" w:hAnsi="Courier New" w:cs="Courier New"/>
-          <w:b/>
-          <w:bCs/>
-        </w:rPr>
+        <w:pStyle w:val="ResimYazs"/>
+        <w:ind w:left="2832" w:firstLine="708"/>
+        <w:jc w:val="both"/>
+        <w:rPr>
+          <w:rFonts w:ascii="Courier New" w:hAnsi="Courier New" w:cs="Courier New"/>
+          <w:sz w:val="20"/>
+          <w:szCs w:val="20"/>
+        </w:rPr>
+      </w:pPr>
+      <w:r>
+        <w:t xml:space="preserve">Şekil </w:t>
+      </w:r>
+      <w:r>
+        <w:fldChar w:fldCharType="begin"/>
+      </w:r>
+      <w:r>
+        <w:instrText xml:space="preserve"> SEQ Şekil \* ARABIC </w:instrText>
+      </w:r>
+      <w:r>
+        <w:fldChar w:fldCharType="separate"/>
+      </w:r>
+      <w:r>
+        <w:t>3</w:t>
+      </w:r>
+      <w:r>
+        <w:fldChar w:fldCharType="end"/>
+      </w:r>
+      <w:r>
+        <w:t xml:space="preserve"> Opcode Tablosu</w:t>
+      </w:r>
+    </w:p>
+    <w:p>
+      <w:pPr>
+        <w:keepNext/>
       </w:pPr>
       <w:r>
         <w:rPr>
@@ -3907,6 +4076,38 @@
     </w:p>
     <w:p>
       <w:pPr>
+        <w:pStyle w:val="ResimYazs"/>
+        <w:ind w:left="2832" w:firstLine="708"/>
+        <w:rPr>
+          <w:rFonts w:ascii="Courier New" w:hAnsi="Courier New" w:cs="Courier New"/>
+          <w:b/>
+          <w:bCs/>
+        </w:rPr>
+      </w:pPr>
+      <w:r>
+        <w:t xml:space="preserve">Şekil </w:t>
+      </w:r>
+      <w:r>
+        <w:fldChar w:fldCharType="begin"/>
+      </w:r>
+      <w:r>
+        <w:instrText xml:space="preserve"> SEQ Şekil \* ARABIC </w:instrText>
+      </w:r>
+      <w:r>
+        <w:fldChar w:fldCharType="separate"/>
+      </w:r>
+      <w:r>
+        <w:t>4</w:t>
+      </w:r>
+      <w:r>
+        <w:fldChar w:fldCharType="end"/>
+      </w:r>
+      <w:r>
+        <w:t xml:space="preserve"> Register</w:t>
+      </w:r>
+    </w:p>
+    <w:p>
+      <w:pPr>
         <w:pStyle w:val="Balk2"/>
         <w:ind w:firstLine="708"/>
         <w:rPr>
@@ -3918,7 +4119,7 @@
           <w:szCs w:val="24"/>
         </w:rPr>
       </w:pPr>
-      <w:bookmarkStart w:id="6" w:name="_Toc226046765"/>
+      <w:bookmarkStart w:id="6" w:name="_Toc226123579"/>
       <w:r>
         <w:rPr>
           <w:rFonts w:ascii="Courier New" w:eastAsiaTheme="minorHAnsi" w:hAnsi="Courier New" w:cs="Courier New"/>
@@ -3946,6 +4147,7 @@
     <w:p>
       <w:pPr>
         <w:spacing w:line="276" w:lineRule="auto"/>
+        <w:ind w:firstLine="708"/>
         <w:jc w:val="both"/>
         <w:rPr>
           <w:rFonts w:ascii="Courier New" w:hAnsi="Courier New" w:cs="Courier New"/>
@@ -3964,12 +4166,8 @@
     </w:p>
     <w:p>
       <w:pPr>
+        <w:keepNext/>
         <w:jc w:val="center"/>
-        <w:rPr>
-          <w:rFonts w:ascii="Courier New" w:hAnsi="Courier New" w:cs="Courier New"/>
-          <w:sz w:val="20"/>
-          <w:szCs w:val="20"/>
-        </w:rPr>
       </w:pPr>
       <w:r>
         <w:rPr>
@@ -4022,6 +4220,38 @@
     </w:p>
     <w:p>
       <w:pPr>
+        <w:pStyle w:val="ResimYazs"/>
+        <w:jc w:val="center"/>
+        <w:rPr>
+          <w:rFonts w:ascii="Courier New" w:hAnsi="Courier New" w:cs="Courier New"/>
+          <w:sz w:val="20"/>
+          <w:szCs w:val="20"/>
+        </w:rPr>
+      </w:pPr>
+      <w:r>
+        <w:t xml:space="preserve">Şekil </w:t>
+      </w:r>
+      <w:r>
+        <w:fldChar w:fldCharType="begin"/>
+      </w:r>
+      <w:r>
+        <w:instrText xml:space="preserve"> SEQ Şekil \* ARABIC </w:instrText>
+      </w:r>
+      <w:r>
+        <w:fldChar w:fldCharType="separate"/>
+      </w:r>
+      <w:r>
+        <w:t>5</w:t>
+      </w:r>
+      <w:r>
+        <w:fldChar w:fldCharType="end"/>
+      </w:r>
+      <w:r>
+        <w:t xml:space="preserve"> Symbol Table</w:t>
+      </w:r>
+    </w:p>
+    <w:p>
+      <w:pPr>
         <w:spacing w:line="276" w:lineRule="auto"/>
         <w:jc w:val="both"/>
         <w:rPr>
@@ -4038,6 +4268,7 @@
           <w:sz w:val="20"/>
           <w:szCs w:val="20"/>
         </w:rPr>
+        <w:lastRenderedPageBreak/>
         <w:t>Hata Yönetimi:</w:t>
       </w:r>
       <w:r>
@@ -4075,16 +4306,7 @@
           <w:sz w:val="20"/>
           <w:szCs w:val="20"/>
         </w:rPr>
-        <w:t xml:space="preserve"> İkinci geçişte (Pass 2), dallanma (branch) komutlarının hedef adresleri hesaplanırken, ihtiyaç duyulan etiket adresi doğrudan SYMTAB </w:t>
-      </w:r>
-      <w:r>
-        <w:rPr>
-          <w:rFonts w:ascii="Courier New" w:hAnsi="Courier New" w:cs="Courier New"/>
-          <w:sz w:val="20"/>
-          <w:szCs w:val="20"/>
-        </w:rPr>
-        <w:lastRenderedPageBreak/>
-        <w:t>üzerinden çekilerek yer değiştirme (displacement) formülüne (Hedef - PC) dahil edilir.</w:t>
+        <w:t xml:space="preserve"> İkinci geçişte (Pass 2), dallanma (branch) komutlarının hedef adresleri hesaplanırken, ihtiyaç duyulan etiket adresi doğrudan SYMTAB üzerinden çekilerek yer değiştirme (displacement) formülüne (Hedef - PC) dahil edilir.</w:t>
       </w:r>
     </w:p>
     <w:p>
@@ -4104,7 +4326,7 @@
           <w:szCs w:val="24"/>
         </w:rPr>
       </w:pPr>
-      <w:bookmarkStart w:id="7" w:name="_Toc226046766"/>
+      <w:bookmarkStart w:id="7" w:name="_Toc226123580"/>
       <w:r>
         <w:rPr>
           <w:rFonts w:ascii="Courier New" w:eastAsiaTheme="minorHAnsi" w:hAnsi="Courier New" w:cs="Courier New"/>
@@ -4128,31 +4350,7 @@
         <w:t>i</w:t>
       </w:r>
       <w:bookmarkEnd w:id="7"/>
-    </w:p>
-    <w:p>
-      <w:pPr>
-        <w:spacing w:line="276" w:lineRule="auto"/>
-        <w:jc w:val="both"/>
-        <w:rPr>
-          <w:rFonts w:ascii="Courier New" w:hAnsi="Courier New" w:cs="Courier New"/>
-          <w:sz w:val="20"/>
-          <w:szCs w:val="20"/>
-        </w:rPr>
-      </w:pPr>
-      <w:r>
-        <w:rPr>
-          <w:rFonts w:ascii="Courier New" w:hAnsi="Courier New" w:cs="Courier New"/>
-          <w:sz w:val="20"/>
-          <w:szCs w:val="20"/>
-        </w:rPr>
-        <w:t>Proje kapsamında geliştirilen assembler algoritmasının en kritik aşaması, ayrıştırılmış assembly komutlarının işlemcinin yürütebileceği 32-bitlik makine kodlarına (object code) dönüştürülmesidir. İkinci geçiş (Pass 2) esnasında, kod üretici (Code Generator) modülü devreye girerek her bir komut formatı (R, I, S, B) için özel donanımsal şablonları doldurur.</w:t>
-      </w:r>
-    </w:p>
-    <w:p>
-      <w:pPr>
-        <w:pStyle w:val="Balk2"/>
-        <w:ind w:firstLine="708"/>
-        <w:jc w:val="both"/>
+      <w:r>
         <w:rPr>
           <w:rFonts w:ascii="Courier New" w:eastAsiaTheme="minorHAnsi" w:hAnsi="Courier New" w:cs="Courier New"/>
           <w:b/>
@@ -4161,9 +4359,34 @@
           <w:sz w:val="24"/>
           <w:szCs w:val="24"/>
         </w:rPr>
-      </w:pPr>
-      <w:bookmarkStart w:id="8" w:name="_Toc226046767"/>
-      <w:r>
+        <w:t xml:space="preserve"> </w:t>
+      </w:r>
+    </w:p>
+    <w:p>
+      <w:pPr>
+        <w:spacing w:line="276" w:lineRule="auto"/>
+        <w:ind w:firstLine="360"/>
+        <w:jc w:val="both"/>
+        <w:rPr>
+          <w:rFonts w:ascii="Courier New" w:hAnsi="Courier New" w:cs="Courier New"/>
+          <w:sz w:val="20"/>
+          <w:szCs w:val="20"/>
+        </w:rPr>
+      </w:pPr>
+      <w:r>
+        <w:rPr>
+          <w:rFonts w:ascii="Courier New" w:hAnsi="Courier New" w:cs="Courier New"/>
+          <w:sz w:val="20"/>
+          <w:szCs w:val="20"/>
+        </w:rPr>
+        <w:t>Proje kapsamında geliştirilen assembler algoritmasının en kritik aşaması, ayrıştırılmış assembly komutlarının işlemcinin yürütebileceği 32-bitlik makine kodlarına (object code) dönüştürülmesidir. İkinci geçiş (Pass 2) esnasında, kod üretici (Code Generator) modülü devreye girerek her bir komut formatı (R, I, S, B) için özel donanımsal şablonları doldurur.</w:t>
+      </w:r>
+    </w:p>
+    <w:p>
+      <w:pPr>
+        <w:pStyle w:val="Balk2"/>
+        <w:ind w:firstLine="708"/>
+        <w:jc w:val="both"/>
         <w:rPr>
           <w:rFonts w:ascii="Courier New" w:eastAsiaTheme="minorHAnsi" w:hAnsi="Courier New" w:cs="Courier New"/>
           <w:b/>
@@ -4172,8 +4395,8 @@
           <w:sz w:val="24"/>
           <w:szCs w:val="24"/>
         </w:rPr>
-        <w:t>5</w:t>
-      </w:r>
+      </w:pPr>
+      <w:bookmarkStart w:id="8" w:name="_Toc226123581"/>
       <w:r>
         <w:rPr>
           <w:rFonts w:ascii="Courier New" w:eastAsiaTheme="minorHAnsi" w:hAnsi="Courier New" w:cs="Courier New"/>
@@ -4183,34 +4406,9 @@
           <w:sz w:val="24"/>
           <w:szCs w:val="24"/>
         </w:rPr>
-        <w:t>.1. Bit Seviyesinde İşlemler (Bitwise Operations)</w:t>
-      </w:r>
-      <w:bookmarkEnd w:id="8"/>
-    </w:p>
-    <w:p>
-      <w:pPr>
-        <w:spacing w:line="276" w:lineRule="auto"/>
-        <w:jc w:val="both"/>
-        <w:rPr>
-          <w:rFonts w:ascii="Courier New" w:hAnsi="Courier New" w:cs="Courier New"/>
-          <w:sz w:val="20"/>
-          <w:szCs w:val="20"/>
-        </w:rPr>
-      </w:pPr>
-      <w:r>
-        <w:rPr>
-          <w:rFonts w:ascii="Courier New" w:hAnsi="Courier New" w:cs="Courier New"/>
-          <w:sz w:val="20"/>
-          <w:szCs w:val="20"/>
-        </w:rPr>
-        <w:t>RISC-V (RV32I) mimarisinde komutlar 32 bit uzunluğundadır ve her bir operandın (register, opcode, immediate) komut içindeki bit pozisyonu kesin olarak tanımlanmıştır. Algoritma, bu 32-bitlik yapıyı oluşturmak için C# dilindeki sola kaydırma (left shift, &lt;&lt;) ve mantıksal VEYA (bitwise OR, |) operatörlerini kullanmaktadır. Bu sayede, parçalanmış veriler matematiksel olarak üst üste bindirilerek yüksek performanslı bir birleştirme işlemi gerçekleştirilir.</w:t>
-      </w:r>
-    </w:p>
-    <w:p>
-      <w:pPr>
-        <w:pStyle w:val="Balk2"/>
-        <w:ind w:firstLine="708"/>
-        <w:jc w:val="both"/>
+        <w:t>5</w:t>
+      </w:r>
+      <w:r>
         <w:rPr>
           <w:rFonts w:ascii="Courier New" w:eastAsiaTheme="minorHAnsi" w:hAnsi="Courier New" w:cs="Courier New"/>
           <w:b/>
@@ -4219,9 +4417,35 @@
           <w:sz w:val="24"/>
           <w:szCs w:val="24"/>
         </w:rPr>
-      </w:pPr>
-      <w:bookmarkStart w:id="9" w:name="_Toc226046768"/>
-      <w:r>
+        <w:t>.1. Bit Seviyesinde İşlemler (Bitwise Operations)</w:t>
+      </w:r>
+      <w:bookmarkEnd w:id="8"/>
+    </w:p>
+    <w:p>
+      <w:pPr>
+        <w:spacing w:line="276" w:lineRule="auto"/>
+        <w:ind w:firstLine="708"/>
+        <w:jc w:val="both"/>
+        <w:rPr>
+          <w:rFonts w:ascii="Courier New" w:hAnsi="Courier New" w:cs="Courier New"/>
+          <w:sz w:val="20"/>
+          <w:szCs w:val="20"/>
+        </w:rPr>
+      </w:pPr>
+      <w:r>
+        <w:rPr>
+          <w:rFonts w:ascii="Courier New" w:hAnsi="Courier New" w:cs="Courier New"/>
+          <w:sz w:val="20"/>
+          <w:szCs w:val="20"/>
+        </w:rPr>
+        <w:t>RISC-V (RV32I) mimarisinde komutlar 32 bit uzunluğundadır ve her bir operandın (register, opcode, immediate) komut içindeki bit pozisyonu kesin olarak tanımlanmıştır. Algoritma, bu 32-bitlik yapıyı oluşturmak için C# dilindeki sola kaydırma (left shift, &lt;&lt;) ve mantıksal VEYA (bitwise OR, |) operatörlerini kullanmaktadır. Bu sayede, parçalanmış veriler matematiksel olarak üst üste bindirilerek yüksek performanslı bir birleştirme işlemi gerçekleştirilir.</w:t>
+      </w:r>
+    </w:p>
+    <w:p>
+      <w:pPr>
+        <w:pStyle w:val="Balk2"/>
+        <w:ind w:firstLine="708"/>
+        <w:jc w:val="both"/>
         <w:rPr>
           <w:rFonts w:ascii="Courier New" w:eastAsiaTheme="minorHAnsi" w:hAnsi="Courier New" w:cs="Courier New"/>
           <w:b/>
@@ -4230,8 +4454,8 @@
           <w:sz w:val="24"/>
           <w:szCs w:val="24"/>
         </w:rPr>
-        <w:t xml:space="preserve">5.2. </w:t>
-      </w:r>
+      </w:pPr>
+      <w:bookmarkStart w:id="9" w:name="_Toc226123582"/>
       <w:r>
         <w:rPr>
           <w:rFonts w:ascii="Courier New" w:eastAsiaTheme="minorHAnsi" w:hAnsi="Courier New" w:cs="Courier New"/>
@@ -4241,9 +4465,8 @@
           <w:sz w:val="24"/>
           <w:szCs w:val="24"/>
         </w:rPr>
-        <w:t>Komut Formatlarının İşlenmesi ve AdreslemeR-Tipi Komutlar</w:t>
-      </w:r>
-      <w:bookmarkEnd w:id="9"/>
+        <w:t xml:space="preserve">5.2. </w:t>
+      </w:r>
       <w:r>
         <w:rPr>
           <w:rFonts w:ascii="Courier New" w:eastAsiaTheme="minorHAnsi" w:hAnsi="Courier New" w:cs="Courier New"/>
@@ -4253,38 +4476,9 @@
           <w:sz w:val="24"/>
           <w:szCs w:val="24"/>
         </w:rPr>
-        <w:t xml:space="preserve"> </w:t>
-      </w:r>
-    </w:p>
-    <w:p>
-      <w:pPr>
-        <w:spacing w:line="276" w:lineRule="auto"/>
-        <w:ind w:firstLine="360"/>
-        <w:jc w:val="both"/>
-        <w:rPr>
-          <w:rFonts w:ascii="Courier New" w:hAnsi="Courier New" w:cs="Courier New"/>
-          <w:sz w:val="20"/>
-          <w:szCs w:val="20"/>
-        </w:rPr>
-      </w:pPr>
-      <w:r>
-        <w:rPr>
-          <w:rFonts w:ascii="Courier New" w:hAnsi="Courier New" w:cs="Courier New"/>
-          <w:sz w:val="20"/>
-          <w:szCs w:val="20"/>
-        </w:rPr>
-        <w:t>Dışarıdan bellek adresi veya sabit sayı almayan, yalnızca registerlar arası çalışan komutlardır. Algoritma; funct7, rs2, rs1, funct3, rd ve opcode değerlerini kendi bit pozisyonlarına kaydırarak birleştirir ve nesne kodunu (object code) üretir.I-Tipi ve S-Tipi Komutlar: Sabit sayılı (immediate) operasyonlar ve belleğe yazma (store) işlemleridir. Algoritmada, kullanıcının girdiği ondalık sayılar veya negatif değerler, 2'ye tümleyen (two's complement) mantığıyla ele alınır. Negatif sayıların 32-bitlik alandan taşıp komutu bozmaması için bit maskeleme (bitwise AND) yöntemleri kullanılarak sadece gerekli olan 12-bitlik kısım güvenli bir şekilde komuta yerleştirilir .B-Tipi (Dallanma) Komutlar: PC-relative (Program Sayacı Göreli) adresleme modunu kullanan komutlardır. Algoritma, dallanma işlemi için hedef adresi Sembol Tablosundan (SYMTAB) çeker. Komut yürütülürken Program Sayacı (PC) güncellenmiş olacağından, hedef adres ile PC arasındaki yer değiştirme (displacement) miktarı (Hedef Adres - PC) matematiksel olarak hesaplanır . Bulunan bu offset değeri, donanım mimarisinin kurallarına uygun olarak parçalanır ve 32-bitlik komutun ilgili bölgelerine dağıtılır.</w:t>
-      </w:r>
-    </w:p>
-    <w:p>
-      <w:pPr>
-        <w:pStyle w:val="Balk2"/>
-        <w:jc w:val="both"/>
-      </w:pPr>
-      <w:r>
-        <w:t xml:space="preserve">       </w:t>
-      </w:r>
-      <w:bookmarkStart w:id="10" w:name="_Toc226046769"/>
+        <w:t>Komut Formatlarının İşlenmesi ve AdreslemeR-Tipi Komutlar</w:t>
+      </w:r>
+      <w:bookmarkEnd w:id="9"/>
       <w:r>
         <w:rPr>
           <w:rFonts w:ascii="Courier New" w:eastAsiaTheme="minorHAnsi" w:hAnsi="Courier New" w:cs="Courier New"/>
@@ -4294,8 +4488,38 @@
           <w:sz w:val="24"/>
           <w:szCs w:val="24"/>
         </w:rPr>
-        <w:t xml:space="preserve">5.3. </w:t>
-      </w:r>
+        <w:t xml:space="preserve"> </w:t>
+      </w:r>
+    </w:p>
+    <w:p>
+      <w:pPr>
+        <w:spacing w:line="276" w:lineRule="auto"/>
+        <w:ind w:firstLine="360"/>
+        <w:jc w:val="both"/>
+        <w:rPr>
+          <w:rFonts w:ascii="Courier New" w:hAnsi="Courier New" w:cs="Courier New"/>
+          <w:sz w:val="20"/>
+          <w:szCs w:val="20"/>
+        </w:rPr>
+      </w:pPr>
+      <w:r>
+        <w:rPr>
+          <w:rFonts w:ascii="Courier New" w:hAnsi="Courier New" w:cs="Courier New"/>
+          <w:sz w:val="20"/>
+          <w:szCs w:val="20"/>
+        </w:rPr>
+        <w:t>Dışarıdan bellek adresi veya sabit sayı almayan, yalnızca registerlar arası çalışan komutlardır. Algoritma; funct7, rs2, rs1, funct3, rd ve opcode değerlerini kendi bit pozisyonlarına kaydırarak birleştirir ve nesne kodunu (object code) üretir.I-Tipi ve S-Tipi Komutlar: Sabit sayılı (immediate) operasyonlar ve belleğe yazma (store) işlemleridir. Algoritmada, kullanıcının girdiği ondalık sayılar veya negatif değerler, 2'ye tümleyen (two's complement) mantığıyla ele alınır. Negatif sayıların 32-bitlik alandan taşıp komutu bozmaması için bit maskeleme (bitwise AND) yöntemleri kullanılarak sadece gerekli olan 12-bitlik kısım güvenli bir şekilde komuta yerleştirilir .B-Tipi (Dallanma) Komutlar: PC-relative (Program Sayacı Göreli) adresleme modunu kullanan komutlardır. Algoritma, dallanma işlemi için hedef adresi Sembol Tablosundan (SYMTAB) çeker. Komut yürütülürken Program Sayacı (PC) güncellenmiş olacağından, hedef adres ile PC arasındaki yer değiştirme (displacement) miktarı (Hedef Adres - PC) matematiksel olarak hesaplanır . Bulunan bu offset değeri, donanım mimarisinin kurallarına uygun olarak parçalanır ve 32-bitlik komutun ilgili bölgelerine dağıtılır.</w:t>
+      </w:r>
+    </w:p>
+    <w:p>
+      <w:pPr>
+        <w:pStyle w:val="Balk2"/>
+        <w:jc w:val="both"/>
+      </w:pPr>
+      <w:r>
+        <w:t xml:space="preserve">       </w:t>
+      </w:r>
+      <w:bookmarkStart w:id="10" w:name="_Toc226123583"/>
       <w:r>
         <w:rPr>
           <w:rFonts w:ascii="Courier New" w:eastAsiaTheme="minorHAnsi" w:hAnsi="Courier New" w:cs="Courier New"/>
@@ -4305,6 +4529,17 @@
           <w:sz w:val="24"/>
           <w:szCs w:val="24"/>
         </w:rPr>
+        <w:t xml:space="preserve">5.3. </w:t>
+      </w:r>
+      <w:r>
+        <w:rPr>
+          <w:rFonts w:ascii="Courier New" w:eastAsiaTheme="minorHAnsi" w:hAnsi="Courier New" w:cs="Courier New"/>
+          <w:b/>
+          <w:bCs/>
+          <w:color w:val="auto"/>
+          <w:sz w:val="24"/>
+          <w:szCs w:val="24"/>
+        </w:rPr>
         <w:t>Hexadecimal Çıktı (Object Code) Üretimi</w:t>
       </w:r>
       <w:bookmarkEnd w:id="10"/>
@@ -4331,13 +4566,9 @@
     </w:p>
     <w:p>
       <w:pPr>
+        <w:keepNext/>
         <w:ind w:firstLine="360"/>
         <w:jc w:val="center"/>
-        <w:rPr>
-          <w:rFonts w:ascii="Courier New" w:hAnsi="Courier New" w:cs="Courier New"/>
-          <w:sz w:val="20"/>
-          <w:szCs w:val="20"/>
-        </w:rPr>
       </w:pPr>
       <w:r>
         <w:rPr>
@@ -4400,6 +4631,38 @@
     </w:p>
     <w:p>
       <w:pPr>
+        <w:pStyle w:val="ResimYazs"/>
+        <w:jc w:val="center"/>
+        <w:rPr>
+          <w:rFonts w:ascii="Courier New" w:hAnsi="Courier New" w:cs="Courier New"/>
+          <w:sz w:val="20"/>
+          <w:szCs w:val="20"/>
+        </w:rPr>
+      </w:pPr>
+      <w:r>
+        <w:t xml:space="preserve">Şekil </w:t>
+      </w:r>
+      <w:r>
+        <w:fldChar w:fldCharType="begin"/>
+      </w:r>
+      <w:r>
+        <w:instrText xml:space="preserve"> SEQ Şekil \* ARABIC </w:instrText>
+      </w:r>
+      <w:r>
+        <w:fldChar w:fldCharType="separate"/>
+      </w:r>
+      <w:r>
+        <w:t>6</w:t>
+      </w:r>
+      <w:r>
+        <w:fldChar w:fldCharType="end"/>
+      </w:r>
+      <w:r>
+        <w:t xml:space="preserve"> Genel Akış Şeması</w:t>
+      </w:r>
+    </w:p>
+    <w:p>
+      <w:pPr>
         <w:pStyle w:val="Balk1"/>
         <w:numPr>
           <w:ilvl w:val="0"/>
@@ -4415,7 +4678,7 @@
           <w:szCs w:val="24"/>
         </w:rPr>
       </w:pPr>
-      <w:bookmarkStart w:id="11" w:name="_Toc226046770"/>
+      <w:bookmarkStart w:id="11" w:name="_Toc226123584"/>
       <w:r>
         <w:rPr>
           <w:rFonts w:ascii="Courier New" w:eastAsiaTheme="minorHAnsi" w:hAnsi="Courier New" w:cs="Courier New"/>
@@ -4443,6 +4706,7 @@
     <w:p>
       <w:pPr>
         <w:spacing w:line="276" w:lineRule="auto"/>
+        <w:ind w:firstLine="360"/>
         <w:jc w:val="both"/>
         <w:rPr>
           <w:rFonts w:ascii="Courier New" w:hAnsi="Courier New" w:cs="Courier New"/>
@@ -4473,7 +4737,7 @@
           <w:szCs w:val="24"/>
         </w:rPr>
       </w:pPr>
-      <w:bookmarkStart w:id="12" w:name="_Toc226046771"/>
+      <w:bookmarkStart w:id="12" w:name="_Toc226123585"/>
       <w:r>
         <w:rPr>
           <w:rFonts w:ascii="Courier New" w:eastAsiaTheme="minorHAnsi" w:hAnsi="Courier New" w:cs="Courier New"/>
@@ -4610,12 +4874,8 @@
     </w:p>
     <w:p>
       <w:pPr>
+        <w:keepNext/>
         <w:jc w:val="both"/>
-        <w:rPr>
-          <w:rFonts w:ascii="Courier New" w:hAnsi="Courier New" w:cs="Courier New"/>
-          <w:sz w:val="20"/>
-          <w:szCs w:val="20"/>
-        </w:rPr>
       </w:pPr>
       <w:r>
         <w:rPr>
@@ -4675,6 +4935,39 @@
     </w:p>
     <w:p>
       <w:pPr>
+        <w:pStyle w:val="ResimYazs"/>
+        <w:ind w:left="2832" w:firstLine="708"/>
+        <w:jc w:val="both"/>
+        <w:rPr>
+          <w:rFonts w:ascii="Courier New" w:hAnsi="Courier New" w:cs="Courier New"/>
+          <w:sz w:val="20"/>
+          <w:szCs w:val="20"/>
+        </w:rPr>
+      </w:pPr>
+      <w:r>
+        <w:t xml:space="preserve">Şekil </w:t>
+      </w:r>
+      <w:r>
+        <w:fldChar w:fldCharType="begin"/>
+      </w:r>
+      <w:r>
+        <w:instrText xml:space="preserve"> SEQ Şekil \* ARABIC </w:instrText>
+      </w:r>
+      <w:r>
+        <w:fldChar w:fldCharType="separate"/>
+      </w:r>
+      <w:r>
+        <w:t>7</w:t>
+      </w:r>
+      <w:r>
+        <w:fldChar w:fldCharType="end"/>
+      </w:r>
+      <w:r>
+        <w:t xml:space="preserve"> Big O Notasyon Grafiği</w:t>
+      </w:r>
+    </w:p>
+    <w:p>
+      <w:pPr>
         <w:pStyle w:val="Balk2"/>
         <w:ind w:firstLine="708"/>
         <w:rPr>
@@ -4686,7 +4979,7 @@
           <w:szCs w:val="24"/>
         </w:rPr>
       </w:pPr>
-      <w:bookmarkStart w:id="13" w:name="_Toc226046772"/>
+      <w:bookmarkStart w:id="13" w:name="_Toc226123586"/>
       <w:r>
         <w:rPr>
           <w:rFonts w:ascii="Courier New" w:eastAsiaTheme="minorHAnsi" w:hAnsi="Courier New" w:cs="Courier New"/>
@@ -4853,7 +5146,7 @@
           <w:szCs w:val="24"/>
         </w:rPr>
       </w:pPr>
-      <w:bookmarkStart w:id="14" w:name="_Toc226046773"/>
+      <w:bookmarkStart w:id="14" w:name="_Toc226123587"/>
       <w:r>
         <w:rPr>
           <w:rFonts w:ascii="Courier New" w:eastAsiaTheme="minorHAnsi" w:hAnsi="Courier New" w:cs="Courier New"/>
@@ -4875,9 +5168,34 @@
           <w:sz w:val="24"/>
           <w:szCs w:val="24"/>
         </w:rPr>
-        <w:t xml:space="preserve"> </w:t>
-      </w:r>
-      <w:r>
+        <w:t xml:space="preserve"> (PÇ7)</w:t>
+      </w:r>
+      <w:bookmarkEnd w:id="14"/>
+    </w:p>
+    <w:p>
+      <w:pPr>
+        <w:spacing w:line="276" w:lineRule="auto"/>
+        <w:ind w:firstLine="360"/>
+        <w:jc w:val="both"/>
+        <w:rPr>
+          <w:rFonts w:ascii="Courier New" w:hAnsi="Courier New" w:cs="Courier New"/>
+          <w:sz w:val="20"/>
+          <w:szCs w:val="20"/>
+        </w:rPr>
+      </w:pPr>
+      <w:r>
+        <w:rPr>
+          <w:rFonts w:ascii="Courier New" w:hAnsi="Courier New" w:cs="Courier New"/>
+          <w:sz w:val="20"/>
+          <w:szCs w:val="20"/>
+        </w:rPr>
+        <w:t>Geliştirilen Assembler yazılımının doğruluğunu (validation) ve güvenilirliğini kanıtlamak amacıyla, RV32I komut alt kümesinin temel özelliklerini (R, I, S, B formatları) barındıran bir test senaryosu hazırlanmıştır. Test programı, register atamalarını, temel aritmetik işlemleri, döngü yapısı ile geriye dönük dallanmayı (backward branching) ve hesaplanan sonucun ana belleğe (store word) aktarılmasını simüle etmektedir.</w:t>
+      </w:r>
+    </w:p>
+    <w:p>
+      <w:pPr>
+        <w:pStyle w:val="Balk2"/>
+        <w:spacing w:line="276" w:lineRule="auto"/>
         <w:rPr>
           <w:rFonts w:ascii="Courier New" w:eastAsiaTheme="minorHAnsi" w:hAnsi="Courier New" w:cs="Courier New"/>
           <w:b/>
@@ -4886,8 +5204,14 @@
           <w:sz w:val="24"/>
           <w:szCs w:val="24"/>
         </w:rPr>
-        <w:t>(PÇ</w:t>
-      </w:r>
+      </w:pPr>
+      <w:r>
+        <w:t xml:space="preserve">    </w:t>
+      </w:r>
+      <w:r>
+        <w:tab/>
+      </w:r>
+      <w:bookmarkStart w:id="15" w:name="_Toc226123588"/>
       <w:r>
         <w:rPr>
           <w:rFonts w:ascii="Courier New" w:eastAsiaTheme="minorHAnsi" w:hAnsi="Courier New" w:cs="Courier New"/>
@@ -4908,13 +5232,14 @@
           <w:sz w:val="24"/>
           <w:szCs w:val="24"/>
         </w:rPr>
-        <w:t>)</w:t>
-      </w:r>
-      <w:bookmarkEnd w:id="14"/>
+        <w:t>.1. Test Assembly Kaynak Kodu (test.s)</w:t>
+      </w:r>
+      <w:bookmarkEnd w:id="15"/>
     </w:p>
     <w:p>
       <w:pPr>
         <w:spacing w:line="276" w:lineRule="auto"/>
+        <w:ind w:firstLine="708"/>
         <w:jc w:val="both"/>
         <w:rPr>
           <w:rFonts w:ascii="Courier New" w:hAnsi="Courier New" w:cs="Courier New"/>
@@ -4928,80 +5253,13 @@
           <w:sz w:val="20"/>
           <w:szCs w:val="20"/>
         </w:rPr>
-        <w:t>Geliştirilen Assembler yazılımının doğruluğunu (validation) ve güvenilirliğini kanıtlamak amacıyla, RV32I komut alt kümesinin temel özelliklerini (R, I, S, B formatları) barındıran bir test senaryosu hazırlanmıştır. Test programı, register atamalarını, temel aritmetik işlemleri, döngü yapısı ile geriye dönük dallanmayı (backward branching) ve hesaplanan sonucun ana belleğe (store word) aktarılmasını simüle etmektedir.</w:t>
-      </w:r>
-    </w:p>
-    <w:p>
-      <w:pPr>
-        <w:pStyle w:val="Balk2"/>
-        <w:spacing w:line="276" w:lineRule="auto"/>
-        <w:rPr>
-          <w:rFonts w:ascii="Courier New" w:eastAsiaTheme="minorHAnsi" w:hAnsi="Courier New" w:cs="Courier New"/>
-          <w:b/>
-          <w:bCs/>
-          <w:color w:val="auto"/>
-          <w:sz w:val="24"/>
-          <w:szCs w:val="24"/>
-        </w:rPr>
-      </w:pPr>
-      <w:r>
-        <w:t xml:space="preserve">    </w:t>
-      </w:r>
-      <w:r>
-        <w:tab/>
-      </w:r>
-      <w:bookmarkStart w:id="15" w:name="_Toc226046774"/>
-      <w:r>
-        <w:rPr>
-          <w:rFonts w:ascii="Courier New" w:eastAsiaTheme="minorHAnsi" w:hAnsi="Courier New" w:cs="Courier New"/>
-          <w:b/>
-          <w:bCs/>
-          <w:color w:val="auto"/>
-          <w:sz w:val="24"/>
-          <w:szCs w:val="24"/>
-        </w:rPr>
-        <w:t>7</w:t>
-      </w:r>
-      <w:r>
-        <w:rPr>
-          <w:rFonts w:ascii="Courier New" w:eastAsiaTheme="minorHAnsi" w:hAnsi="Courier New" w:cs="Courier New"/>
-          <w:b/>
-          <w:bCs/>
-          <w:color w:val="auto"/>
-          <w:sz w:val="24"/>
-          <w:szCs w:val="24"/>
-        </w:rPr>
-        <w:t>.1. Test Assembly Kaynak Kodu (test.s)</w:t>
-      </w:r>
-      <w:bookmarkEnd w:id="15"/>
-    </w:p>
-    <w:p>
-      <w:pPr>
-        <w:spacing w:line="276" w:lineRule="auto"/>
+        <w:t>Test aşamasında sisteme girdi olarak aşağıdaki mnemonic'leri içeren assembly dosyası verilmiştir. Program, x1 ve x2 register'larına değer atayıp toplayan, ardından bir koşullu döngü yardımıyla x1 değerini x2'ye eşit olana kadar artıran ve son olarak sonucu belleğe kaydeden bir algoritmadır:</w:t>
+      </w:r>
+    </w:p>
+    <w:p>
+      <w:pPr>
+        <w:keepNext/>
         <w:jc w:val="both"/>
-        <w:rPr>
-          <w:rFonts w:ascii="Courier New" w:hAnsi="Courier New" w:cs="Courier New"/>
-          <w:sz w:val="20"/>
-          <w:szCs w:val="20"/>
-        </w:rPr>
-      </w:pPr>
-      <w:r>
-        <w:rPr>
-          <w:rFonts w:ascii="Courier New" w:hAnsi="Courier New" w:cs="Courier New"/>
-          <w:sz w:val="20"/>
-          <w:szCs w:val="20"/>
-        </w:rPr>
-        <w:t>Test aşamasında sisteme girdi olarak aşağıdaki mnemonic'leri içeren assembly dosyası verilmiştir. Program, x1 ve x2 register'larına değer atayıp toplayan, ardından bir koşullu döngü yardımıyla x1 değerini x2'ye eşit olana kadar artıran ve son olarak sonucu belleğe kaydeden bir algoritmadır:</w:t>
-      </w:r>
-    </w:p>
-    <w:p>
-      <w:pPr>
-        <w:jc w:val="both"/>
-        <w:rPr>
-          <w:rFonts w:ascii="Courier New" w:hAnsi="Courier New" w:cs="Courier New"/>
-          <w:sz w:val="20"/>
-          <w:szCs w:val="20"/>
-        </w:rPr>
       </w:pPr>
       <w:r>
         <w:rPr>
@@ -5054,6 +5312,39 @@
     </w:p>
     <w:p>
       <w:pPr>
+        <w:pStyle w:val="ResimYazs"/>
+        <w:ind w:left="2832" w:firstLine="708"/>
+        <w:jc w:val="both"/>
+        <w:rPr>
+          <w:rFonts w:ascii="Courier New" w:hAnsi="Courier New" w:cs="Courier New"/>
+          <w:sz w:val="20"/>
+          <w:szCs w:val="20"/>
+        </w:rPr>
+      </w:pPr>
+      <w:r>
+        <w:t xml:space="preserve">Şekil </w:t>
+      </w:r>
+      <w:r>
+        <w:fldChar w:fldCharType="begin"/>
+      </w:r>
+      <w:r>
+        <w:instrText xml:space="preserve"> SEQ Şekil \* ARABIC </w:instrText>
+      </w:r>
+      <w:r>
+        <w:fldChar w:fldCharType="separate"/>
+      </w:r>
+      <w:r>
+        <w:t>8</w:t>
+      </w:r>
+      <w:r>
+        <w:fldChar w:fldCharType="end"/>
+      </w:r>
+      <w:r>
+        <w:t xml:space="preserve"> Test Programı</w:t>
+      </w:r>
+    </w:p>
+    <w:p>
+      <w:pPr>
         <w:pStyle w:val="Balk2"/>
         <w:spacing w:line="276" w:lineRule="auto"/>
         <w:ind w:firstLine="708"/>
@@ -5066,7 +5357,7 @@
           <w:szCs w:val="24"/>
         </w:rPr>
       </w:pPr>
-      <w:bookmarkStart w:id="16" w:name="_Toc226046775"/>
+      <w:bookmarkStart w:id="16" w:name="_Toc226123589"/>
       <w:r>
         <w:rPr>
           <w:rFonts w:ascii="Courier New" w:eastAsiaTheme="minorHAnsi" w:hAnsi="Courier New" w:cs="Courier New"/>
@@ -5094,6 +5385,7 @@
     <w:p>
       <w:pPr>
         <w:spacing w:line="276" w:lineRule="auto"/>
+        <w:ind w:firstLine="708"/>
         <w:jc w:val="both"/>
         <w:rPr>
           <w:rFonts w:ascii="Courier New" w:hAnsi="Courier New" w:cs="Courier New"/>
@@ -5113,6 +5405,7 @@
     <w:p>
       <w:pPr>
         <w:spacing w:line="276" w:lineRule="auto"/>
+        <w:ind w:firstLine="708"/>
         <w:jc w:val="both"/>
         <w:rPr>
           <w:rFonts w:ascii="Courier New" w:hAnsi="Courier New" w:cs="Courier New"/>
@@ -5131,19 +5424,16 @@
     </w:p>
     <w:p>
       <w:pPr>
+        <w:keepNext/>
         <w:jc w:val="both"/>
-        <w:rPr>
-          <w:rFonts w:ascii="Courier New" w:hAnsi="Courier New" w:cs="Courier New"/>
-          <w:sz w:val="20"/>
-          <w:szCs w:val="20"/>
-        </w:rPr>
-      </w:pPr>
-      <w:r>
-        <w:rPr>
-          <w:rFonts w:ascii="Courier New" w:hAnsi="Courier New" w:cs="Courier New"/>
-          <w:sz w:val="20"/>
-          <w:szCs w:val="20"/>
-        </w:rPr>
+      </w:pPr>
+      <w:r>
+        <w:rPr>
+          <w:rFonts w:ascii="Courier New" w:hAnsi="Courier New" w:cs="Courier New"/>
+          <w:sz w:val="20"/>
+          <w:szCs w:val="20"/>
+        </w:rPr>
+        <w:lastRenderedPageBreak/>
         <w:drawing>
           <wp:inline distT="0" distB="0" distL="0" distR="0" wp14:anchorId="0EBFF1F8" wp14:editId="0B47C94C">
             <wp:extent cx="5759450" cy="1361440"/>
@@ -5189,6 +5479,8 @@
     </w:p>
     <w:p>
       <w:pPr>
+        <w:pStyle w:val="ResimYazs"/>
+        <w:ind w:left="2832" w:firstLine="708"/>
         <w:jc w:val="both"/>
         <w:rPr>
           <w:rFonts w:ascii="Courier New" w:hAnsi="Courier New" w:cs="Courier New"/>
@@ -5196,16 +5488,33 @@
           <w:szCs w:val="20"/>
         </w:rPr>
       </w:pPr>
-    </w:p>
-    <w:p>
-      <w:pPr>
-        <w:spacing w:line="276" w:lineRule="auto"/>
+      <w:r>
+        <w:t xml:space="preserve">Şekil </w:t>
+      </w:r>
+      <w:r>
+        <w:fldChar w:fldCharType="begin"/>
+      </w:r>
+      <w:r>
+        <w:instrText xml:space="preserve"> SEQ Şekil \* ARABIC </w:instrText>
+      </w:r>
+      <w:r>
+        <w:fldChar w:fldCharType="separate"/>
+      </w:r>
+      <w:r>
+        <w:t>9</w:t>
+      </w:r>
+      <w:r>
+        <w:fldChar w:fldCharType="end"/>
+      </w:r>
+      <w:r>
+        <w:t xml:space="preserve"> Örnek Output Çıktısı</w:t>
+      </w:r>
+    </w:p>
+    <w:p>
+      <w:pPr>
+        <w:keepNext/>
+        <w:spacing w:after="0" w:line="276" w:lineRule="auto"/>
         <w:jc w:val="both"/>
-        <w:rPr>
-          <w:rFonts w:ascii="Courier New" w:hAnsi="Courier New" w:cs="Courier New"/>
-          <w:b/>
-          <w:bCs/>
-        </w:rPr>
       </w:pPr>
       <w:r>
         <w:rPr>
@@ -5264,102 +5573,185 @@
           </wp:inline>
         </w:drawing>
       </w:r>
-      <w:r>
+    </w:p>
+    <w:p>
+      <w:pPr>
+        <w:pStyle w:val="ResimYazs"/>
+        <w:spacing w:after="0"/>
+        <w:ind w:left="2832" w:firstLine="708"/>
+        <w:jc w:val="both"/>
+      </w:pPr>
+      <w:r>
+        <w:t xml:space="preserve">Şekil </w:t>
+      </w:r>
+      <w:r>
+        <w:fldChar w:fldCharType="begin"/>
+      </w:r>
+      <w:r>
+        <w:instrText xml:space="preserve"> SEQ Şekil \* ARABIC </w:instrText>
+      </w:r>
+      <w:r>
+        <w:fldChar w:fldCharType="separate"/>
+      </w:r>
+      <w:r>
+        <w:t>10</w:t>
+      </w:r>
+      <w:r>
+        <w:fldChar w:fldCharType="end"/>
+      </w:r>
+      <w:r>
+        <w:t xml:space="preserve"> Hex Çıktı Tablosu</w:t>
+      </w:r>
+    </w:p>
+    <w:p>
+      <w:pPr>
+        <w:spacing w:after="0" w:line="276" w:lineRule="auto"/>
+        <w:ind w:firstLine="708"/>
+        <w:jc w:val="both"/>
         <w:rPr>
           <w:rFonts w:ascii="Courier New" w:hAnsi="Courier New" w:cs="Courier New"/>
           <w:b/>
           <w:bCs/>
         </w:rPr>
-        <w:t xml:space="preserve">8. </w:t>
-      </w:r>
+      </w:pPr>
       <w:r>
         <w:rPr>
           <w:rFonts w:ascii="Courier New" w:hAnsi="Courier New" w:cs="Courier New"/>
           <w:b/>
           <w:bCs/>
         </w:rPr>
+        <w:t xml:space="preserve">8. </w:t>
+      </w:r>
+      <w:r>
+        <w:rPr>
+          <w:rFonts w:ascii="Courier New" w:hAnsi="Courier New" w:cs="Courier New"/>
+          <w:b/>
+          <w:bCs/>
+        </w:rPr>
         <w:t>Sonuç, Mühendislik Etkileri ve Takım Çalışması</w:t>
       </w:r>
     </w:p>
     <w:p>
       <w:pPr>
-        <w:spacing w:line="276" w:lineRule="auto"/>
+        <w:spacing w:after="0" w:line="276" w:lineRule="auto"/>
+        <w:ind w:left="708" w:firstLine="708"/>
+        <w:jc w:val="both"/>
+        <w:rPr>
+          <w:rFonts w:ascii="Courier New" w:hAnsi="Courier New" w:cs="Courier New"/>
+          <w:b/>
+          <w:bCs/>
+        </w:rPr>
+      </w:pPr>
+      <w:r>
+        <w:rPr>
+          <w:rFonts w:ascii="Courier New" w:hAnsi="Courier New" w:cs="Courier New"/>
+          <w:b/>
+          <w:bCs/>
+        </w:rPr>
+        <w:t>8</w:t>
+      </w:r>
+      <w:r>
+        <w:rPr>
+          <w:rFonts w:ascii="Courier New" w:hAnsi="Courier New" w:cs="Courier New"/>
+          <w:b/>
+          <w:bCs/>
+        </w:rPr>
+        <w:t>.1. Sonuç ve Değerlendirme</w:t>
+      </w:r>
+    </w:p>
+    <w:p>
+      <w:pPr>
+        <w:keepNext/>
+        <w:spacing w:after="0" w:line="276" w:lineRule="auto"/>
         <w:ind w:firstLine="708"/>
         <w:jc w:val="both"/>
-        <w:rPr>
-          <w:rFonts w:ascii="Courier New" w:hAnsi="Courier New" w:cs="Courier New"/>
-          <w:b/>
-          <w:bCs/>
-        </w:rPr>
-      </w:pPr>
-      <w:r>
-        <w:rPr>
-          <w:rFonts w:ascii="Courier New" w:hAnsi="Courier New" w:cs="Courier New"/>
-          <w:b/>
-          <w:bCs/>
-        </w:rPr>
-        <w:t>8</w:t>
-      </w:r>
-      <w:r>
-        <w:rPr>
-          <w:rFonts w:ascii="Courier New" w:hAnsi="Courier New" w:cs="Courier New"/>
-          <w:b/>
-          <w:bCs/>
-        </w:rPr>
-        <w:t>.1. Sonuç ve Değerlendirme</w:t>
-      </w:r>
-    </w:p>
-    <w:p>
-      <w:pPr>
+      </w:pPr>
+      <w:r>
+        <w:rPr>
+          <w:rFonts w:ascii="Courier New" w:hAnsi="Courier New" w:cs="Courier New"/>
+          <w:sz w:val="20"/>
+          <w:szCs w:val="20"/>
+        </w:rPr>
+        <w:t>Bu proje kapsamında, PicoRV (RV32I) işlemci mimarisine tam uyumlu, iki geçişli (two-pass) bir assembler yazılımı C# programlama dili kullanılarak sıfırdan tasarlanmış ve başarıyla gerçeklenmiştir. Geliştirilen sistem; R, I, S ve B formatlarındaki komutları bit seviyesinde (bitwise) hassasiyetle işlemiş; bellek adresleme modlarını (PC-relative ve Base-relative) ile ileri yönlü etiket referanslarını (forward references) O(1) zaman karmaşıklığına sahip Hash Table (Dictionary) veri yapılarıyla kusursuz şekilde çözümlemiştir. Üretilen 32-bitlik nesne kodlarının ve Hexadecimal çıktıların, dünya standardı simülatörlerle (Venus) yapılan çapraz doğrulamalar (cross-</w:t>
+      </w:r>
+      <w:r>
+        <w:rPr>
+          <w:rFonts w:ascii="Courier New" w:hAnsi="Courier New" w:cs="Courier New"/>
+          <w:sz w:val="20"/>
+          <w:szCs w:val="20"/>
+        </w:rPr>
+        <w:lastRenderedPageBreak/>
+        <w:t>validation) sonucunda teorik RISC-V donanım kurallarıyla</w:t>
+      </w:r>
+      <w:r>
+        <w:rPr>
+          <w:rFonts w:ascii="Courier New" w:hAnsi="Courier New" w:cs="Courier New"/>
+          <w:sz w:val="20"/>
+          <w:szCs w:val="20"/>
+        </w:rPr>
+        <w:t xml:space="preserve"> </w:t>
+      </w:r>
+      <w:r>
+        <w:rPr>
+          <w:rFonts w:ascii="Courier New" w:hAnsi="Courier New" w:cs="Courier New"/>
+          <w:sz w:val="20"/>
+          <w:szCs w:val="20"/>
+        </w:rPr>
+        <w:t xml:space="preserve">uyuştuğu kanıtlanmış ve sistemin tam güvenilirlikle çalıştığı </w:t>
+      </w:r>
+      <w:r>
+        <w:rPr>
+          <w:rFonts w:ascii="Courier New" w:hAnsi="Courier New" w:cs="Courier New"/>
+          <w:sz w:val="20"/>
+          <w:szCs w:val="20"/>
+        </w:rPr>
+        <w:t>sonuçlarda gör</w:t>
+      </w:r>
+      <w:r>
+        <w:rPr>
+          <w:rFonts w:ascii="Courier New" w:hAnsi="Courier New" w:cs="Courier New"/>
+          <w:sz w:val="20"/>
+          <w:szCs w:val="20"/>
+        </w:rPr>
+        <w:t>ülmüştür</w:t>
+      </w:r>
+      <w:r>
+        <w:rPr>
+          <w:rFonts w:ascii="Courier New" w:hAnsi="Courier New" w:cs="Courier New"/>
+          <w:sz w:val="20"/>
+          <w:szCs w:val="20"/>
+        </w:rPr>
+        <w:t>[</w:t>
+      </w:r>
+      <w:r>
+        <w:rPr>
+          <w:rFonts w:ascii="Courier New" w:hAnsi="Courier New" w:cs="Courier New"/>
+          <w:sz w:val="20"/>
+          <w:szCs w:val="20"/>
+        </w:rPr>
+        <w:t>5</w:t>
+      </w:r>
+      <w:r>
+        <w:rPr>
+          <w:rFonts w:ascii="Courier New" w:hAnsi="Courier New" w:cs="Courier New"/>
+          <w:sz w:val="20"/>
+          <w:szCs w:val="20"/>
+        </w:rPr>
+        <w:t>].</w:t>
+      </w:r>
+      <w:r>
+        <w:t xml:space="preserve"> </w:t>
+      </w:r>
+    </w:p>
+    <w:p>
+      <w:pPr>
+        <w:keepNext/>
         <w:spacing w:line="276" w:lineRule="auto"/>
         <w:jc w:val="both"/>
       </w:pPr>
       <w:r>
-        <w:rPr>
-          <w:rFonts w:ascii="Courier New" w:hAnsi="Courier New" w:cs="Courier New"/>
-          <w:sz w:val="20"/>
-          <w:szCs w:val="20"/>
-        </w:rPr>
-        <w:t xml:space="preserve">Bu proje kapsamında, PicoRV (RV32I) işlemci mimarisine tam uyumlu, iki geçişli (two-pass) bir assembler yazılımı C# programlama dili kullanılarak sıfırdan tasarlanmış ve başarıyla gerçeklenmiştir. Geliştirilen sistem; R, I, S ve B formatlarındaki komutları bit seviyesinde (bitwise) hassasiyetle işlemiş; bellek adresleme modlarını (PC-relative ve Base-relative) ile ileri yönlü etiket referanslarını (forward references) O(1) zaman karmaşıklığına sahip Hash Table (Dictionary) veri yapılarıyla kusursuz şekilde çözümlemiştir. Üretilen 32-bitlik nesne kodlarının (object code) ve Hexadecimal çıktıların, dünya standardı simülatörlerle (Venus) yapılan çapraz doğrulamalar (cross-validation) sonucunda teorik RISC-V donanım kurallarıyla uyuştuğu kanıtlanmış ve sistemin tam güvenilirlikle çalıştığı </w:t>
-      </w:r>
-      <w:r>
-        <w:rPr>
-          <w:rFonts w:ascii="Courier New" w:hAnsi="Courier New" w:cs="Courier New"/>
-          <w:sz w:val="20"/>
-          <w:szCs w:val="20"/>
-        </w:rPr>
-        <w:t>sonuçlarda görülmüştür</w:t>
-      </w:r>
-      <w:r>
-        <w:rPr>
-          <w:rFonts w:ascii="Courier New" w:hAnsi="Courier New" w:cs="Courier New"/>
-          <w:sz w:val="20"/>
-          <w:szCs w:val="20"/>
-        </w:rPr>
-        <w:t xml:space="preserve"> [</w:t>
-      </w:r>
-      <w:r>
-        <w:rPr>
-          <w:rFonts w:ascii="Courier New" w:hAnsi="Courier New" w:cs="Courier New"/>
-          <w:sz w:val="20"/>
-          <w:szCs w:val="20"/>
-        </w:rPr>
-        <w:t>5</w:t>
-      </w:r>
-      <w:r>
-        <w:rPr>
-          <w:rFonts w:ascii="Courier New" w:hAnsi="Courier New" w:cs="Courier New"/>
-          <w:sz w:val="20"/>
-          <w:szCs w:val="20"/>
-        </w:rPr>
-        <w:t>].</w:t>
-      </w:r>
-      <w:r>
-        <w:t xml:space="preserve"> </w:t>
-      </w:r>
-      <w:r>
         <w:drawing>
-          <wp:inline distT="0" distB="0" distL="0" distR="0" wp14:anchorId="03913F29" wp14:editId="0AE438FD">
+          <wp:inline distT="0" distB="0" distL="0" distR="0" wp14:anchorId="03913F29" wp14:editId="08D117C6">
             <wp:extent cx="5759450" cy="2933700"/>
             <wp:effectExtent l="0" t="0" r="0" b="0"/>
             <wp:docPr id="1423019456" name="Resim 7"/>
@@ -5403,17 +5795,37 @@
     </w:p>
     <w:p>
       <w:pPr>
+        <w:pStyle w:val="ResimYazs"/>
+        <w:ind w:left="2124" w:firstLine="708"/>
         <w:jc w:val="both"/>
-        <w:rPr>
-          <w:rFonts w:ascii="Courier New" w:hAnsi="Courier New" w:cs="Courier New"/>
-          <w:b/>
-          <w:bCs/>
-        </w:rPr>
-      </w:pPr>
-    </w:p>
-    <w:p>
-      <w:r>
-        <w:lastRenderedPageBreak/>
+      </w:pPr>
+      <w:r>
+        <w:t xml:space="preserve">Şekil </w:t>
+      </w:r>
+      <w:r>
+        <w:fldChar w:fldCharType="begin"/>
+      </w:r>
+      <w:r>
+        <w:instrText xml:space="preserve"> SEQ Şekil \* ARABIC </w:instrText>
+      </w:r>
+      <w:r>
+        <w:fldChar w:fldCharType="separate"/>
+      </w:r>
+      <w:r>
+        <w:t>11</w:t>
+      </w:r>
+      <w:r>
+        <w:fldChar w:fldCharType="end"/>
+      </w:r>
+      <w:r>
+        <w:t xml:space="preserve"> Açık Kaynak Program Çıktısı</w:t>
+      </w:r>
+    </w:p>
+    <w:p>
+      <w:pPr>
+        <w:keepNext/>
+      </w:pPr>
+      <w:r>
         <w:drawing>
           <wp:inline distT="0" distB="0" distL="0" distR="0" wp14:anchorId="6C46051C" wp14:editId="57D505BE">
             <wp:extent cx="5759450" cy="2522220"/>
@@ -5459,11 +5871,38 @@
     </w:p>
     <w:p>
       <w:pPr>
+        <w:pStyle w:val="ResimYazs"/>
+        <w:ind w:left="2124" w:firstLine="708"/>
+      </w:pPr>
+      <w:r>
+        <w:t xml:space="preserve">Şekil </w:t>
+      </w:r>
+      <w:r>
+        <w:fldChar w:fldCharType="begin"/>
+      </w:r>
+      <w:r>
+        <w:instrText xml:space="preserve"> SEQ Şekil \* ARABIC </w:instrText>
+      </w:r>
+      <w:r>
+        <w:fldChar w:fldCharType="separate"/>
+      </w:r>
+      <w:r>
+        <w:t>12</w:t>
+      </w:r>
+      <w:r>
+        <w:fldChar w:fldCharType="end"/>
+      </w:r>
+      <w:r>
+        <w:t xml:space="preserve"> Açık Kaynak Örnek Program</w:t>
+      </w:r>
+    </w:p>
+    <w:p>
+      <w:pPr>
         <w:pStyle w:val="Balk2"/>
         <w:spacing w:line="276" w:lineRule="auto"/>
         <w:jc w:val="both"/>
       </w:pPr>
-      <w:bookmarkStart w:id="17" w:name="_Toc226046776"/>
+      <w:bookmarkStart w:id="17" w:name="_Toc226123590"/>
       <w:r>
         <w:rPr>
           <w:rFonts w:ascii="Courier New" w:eastAsiaTheme="minorHAnsi" w:hAnsi="Courier New" w:cs="Courier New"/>
@@ -5504,9 +5943,72 @@
           <w:sz w:val="24"/>
           <w:szCs w:val="24"/>
         </w:rPr>
-        <w:t>(PÇ</w:t>
-      </w:r>
-      <w:r>
+        <w:t>(PÇ8)</w:t>
+      </w:r>
+      <w:bookmarkEnd w:id="17"/>
+    </w:p>
+    <w:p>
+      <w:pPr>
+        <w:spacing w:line="276" w:lineRule="auto"/>
+        <w:ind w:firstLine="708"/>
+        <w:jc w:val="both"/>
+        <w:rPr>
+          <w:rFonts w:ascii="Courier New" w:hAnsi="Courier New" w:cs="Courier New"/>
+          <w:b/>
+          <w:bCs/>
+          <w:sz w:val="20"/>
+          <w:szCs w:val="20"/>
+        </w:rPr>
+      </w:pPr>
+      <w:r>
+        <w:rPr>
+          <w:rFonts w:ascii="Courier New" w:hAnsi="Courier New" w:cs="Courier New"/>
+          <w:sz w:val="20"/>
+          <w:szCs w:val="20"/>
+        </w:rPr>
+        <w:t>Geliştirilen bu projenin bilgisayar mühendisliği eğitimi ve açık kaynak kültürü üzerinde pratik etkileri bulunmaktadır. Günümüzde hızla yaygınlaşan açık kaynaklı RISC-V mimarisi, donanım dünyasında geleneksel işlemcilere karşı önemli bir alternatif haline gelmiştir [</w:t>
+      </w:r>
+      <w:r>
+        <w:rPr>
+          <w:rFonts w:ascii="Courier New" w:hAnsi="Courier New" w:cs="Courier New"/>
+          <w:sz w:val="20"/>
+          <w:szCs w:val="20"/>
+        </w:rPr>
+        <w:t>6</w:t>
+      </w:r>
+      <w:r>
+        <w:rPr>
+          <w:rFonts w:ascii="Courier New" w:hAnsi="Courier New" w:cs="Courier New"/>
+          <w:sz w:val="20"/>
+          <w:szCs w:val="20"/>
+        </w:rPr>
+        <w:t xml:space="preserve">]. Bu proje kapsamında geliştirdiğimiz assembler, bizim gibi bilgisayar mimarisi ve mikroişlemci dersleri alan öğrenciler için faydalı bir eğitim aracıdır. Yazılımın; assembly komutlarının makine diline nasıl çevrildiğini, bellek adreslerinin (PC-relative) nasıl hesaplandığını ve bitlerin nasıl birleştirildiğini şeffaf bir şekilde göstermesi, derleme sürecinin arka planını anlamayı kolaylaştırmaktadır. Ayrıca, yazdığımız kaynak kodların GitHub üzerinden açık </w:t>
+      </w:r>
+      <w:r>
+        <w:rPr>
+          <w:rFonts w:ascii="Courier New" w:hAnsi="Courier New" w:cs="Courier New"/>
+          <w:sz w:val="20"/>
+          <w:szCs w:val="20"/>
+        </w:rPr>
+        <w:lastRenderedPageBreak/>
+        <w:t>kaynaklı olarak dokümantasyonuyla birlikte paylaşılması, yazılım topluluğuna ve bizden sonraki öğrencilerin çalışmalarına doğrudan katkı sağlamaktadır.</w:t>
+      </w:r>
+      <w:r>
+        <w:rPr>
+          <w:rFonts w:ascii="Courier New" w:hAnsi="Courier New" w:cs="Courier New"/>
+          <w:b/>
+          <w:bCs/>
+          <w:sz w:val="20"/>
+          <w:szCs w:val="20"/>
+        </w:rPr>
+        <w:t xml:space="preserve">   </w:t>
+      </w:r>
+    </w:p>
+    <w:p>
+      <w:pPr>
+        <w:pStyle w:val="Balk2"/>
+        <w:spacing w:line="276" w:lineRule="auto"/>
+        <w:jc w:val="both"/>
         <w:rPr>
           <w:rFonts w:ascii="Courier New" w:eastAsiaTheme="minorHAnsi" w:hAnsi="Courier New" w:cs="Courier New"/>
           <w:b/>
@@ -5515,8 +6017,8 @@
           <w:sz w:val="24"/>
           <w:szCs w:val="24"/>
         </w:rPr>
-        <w:t>8</w:t>
-      </w:r>
+      </w:pPr>
+      <w:bookmarkStart w:id="18" w:name="_Toc226123591"/>
       <w:r>
         <w:rPr>
           <w:rFonts w:ascii="Courier New" w:eastAsiaTheme="minorHAnsi" w:hAnsi="Courier New" w:cs="Courier New"/>
@@ -5526,62 +6028,9 @@
           <w:sz w:val="24"/>
           <w:szCs w:val="24"/>
         </w:rPr>
-        <w:t>)</w:t>
-      </w:r>
-      <w:bookmarkEnd w:id="17"/>
-    </w:p>
-    <w:p>
-      <w:pPr>
-        <w:spacing w:line="276" w:lineRule="auto"/>
-        <w:jc w:val="both"/>
-        <w:rPr>
-          <w:rFonts w:ascii="Courier New" w:hAnsi="Courier New" w:cs="Courier New"/>
-          <w:b/>
-          <w:bCs/>
-          <w:sz w:val="20"/>
-          <w:szCs w:val="20"/>
-        </w:rPr>
-      </w:pPr>
-      <w:r>
-        <w:rPr>
-          <w:rFonts w:ascii="Courier New" w:hAnsi="Courier New" w:cs="Courier New"/>
-          <w:sz w:val="20"/>
-          <w:szCs w:val="20"/>
-        </w:rPr>
-        <w:t>Geliştirilen bu projenin bilgisayar mühendisliği eğitimi ve açık kaynak kültürü üzerinde pratik etkileri bulunmaktadır. Günümüzde hızla yaygınlaşan açık kaynaklı RISC-V mimarisi, donanım dünyasında geleneksel işlemcilere karşı önemli bir alternatif haline gelmiştir [</w:t>
-      </w:r>
-      <w:r>
-        <w:rPr>
-          <w:rFonts w:ascii="Courier New" w:hAnsi="Courier New" w:cs="Courier New"/>
-          <w:sz w:val="20"/>
-          <w:szCs w:val="20"/>
-        </w:rPr>
-        <w:t>6</w:t>
-      </w:r>
-      <w:r>
-        <w:rPr>
-          <w:rFonts w:ascii="Courier New" w:hAnsi="Courier New" w:cs="Courier New"/>
-          <w:sz w:val="20"/>
-          <w:szCs w:val="20"/>
-        </w:rPr>
-        <w:t>]. Bu proje kapsamında geliştirdiğimiz assembler, bizim gibi bilgisayar mimarisi ve mikroişlemci dersleri alan öğrenciler için faydalı bir eğitim aracıdır. Yazılımın; assembly komutlarının makine diline nasıl çevrildiğini, bellek adreslerinin (PC-relative) nasıl hesaplandığını ve bitlerin nasıl birleştirildiğini şeffaf bir şekilde göstermesi, derleme sürecinin arka planını anlamayı kolaylaştırmaktadır. Ayrıca, yazdığımız kaynak kodların GitHub üzerinden açık kaynaklı olarak dokümantasyonuyla birlikte paylaşılması, yazılım topluluğuna ve bizden sonraki öğrencilerin çalışmalarına doğrudan katkı sağlamaktadır.</w:t>
-      </w:r>
-      <w:r>
-        <w:rPr>
-          <w:rFonts w:ascii="Courier New" w:hAnsi="Courier New" w:cs="Courier New"/>
-          <w:b/>
-          <w:bCs/>
-          <w:sz w:val="20"/>
-          <w:szCs w:val="20"/>
-        </w:rPr>
-        <w:t xml:space="preserve">   </w:t>
-      </w:r>
-    </w:p>
-    <w:p>
-      <w:pPr>
-        <w:pStyle w:val="Balk2"/>
-        <w:spacing w:line="276" w:lineRule="auto"/>
-        <w:jc w:val="both"/>
+        <w:t>8</w:t>
+      </w:r>
+      <w:r>
         <w:rPr>
           <w:rFonts w:ascii="Courier New" w:eastAsiaTheme="minorHAnsi" w:hAnsi="Courier New" w:cs="Courier New"/>
           <w:b/>
@@ -5590,8 +6039,8 @@
           <w:sz w:val="24"/>
           <w:szCs w:val="24"/>
         </w:rPr>
-      </w:pPr>
-      <w:bookmarkStart w:id="18" w:name="_Toc226046777"/>
+        <w:t>.3. Takım Çalışması ve Proje Yönetimi</w:t>
+      </w:r>
       <w:r>
         <w:rPr>
           <w:rFonts w:ascii="Courier New" w:eastAsiaTheme="minorHAnsi" w:hAnsi="Courier New" w:cs="Courier New"/>
@@ -5601,9 +6050,725 @@
           <w:sz w:val="24"/>
           <w:szCs w:val="24"/>
         </w:rPr>
-        <w:t>8</w:t>
-      </w:r>
-      <w:r>
+        <w:t xml:space="preserve"> (PÇ12 – PÇ13)</w:t>
+      </w:r>
+      <w:bookmarkEnd w:id="18"/>
+    </w:p>
+    <w:p>
+      <w:pPr>
+        <w:spacing w:line="276" w:lineRule="auto"/>
+        <w:ind w:firstLine="708"/>
+        <w:jc w:val="both"/>
+        <w:rPr>
+          <w:rFonts w:ascii="Courier New" w:hAnsi="Courier New" w:cs="Courier New"/>
+          <w:sz w:val="20"/>
+          <w:szCs w:val="20"/>
+        </w:rPr>
+      </w:pPr>
+      <w:r>
+        <w:rPr>
+          <w:rFonts w:ascii="Courier New" w:hAnsi="Courier New" w:cs="Courier New"/>
+          <w:sz w:val="20"/>
+          <w:szCs w:val="20"/>
+        </w:rPr>
+        <w:t>Projenin geliştirilme süreci, yazılım mühendisliği prensiplerine uygun olarak modüler bir iş bölümü ile yürütülmüştür. Assembler'ın mimarisi; ayrıştırıcı (Parser), kod üretici (Code Generator) ve veri yöneticisi (Symbol ve Opcode Tables) olmak üzere bağımsız sınıflara ayrılmıştır. Bu modüler yaklaşım, proje bileşenlerinin eşzamanlı olarak geliştirilmesine, test edilmesine ve hata ayıklama (debugging) süreçlerinin kolaylaşmasına olanak tanımıştır. Ayrıca kod versiyonlama ve dokümantasyon süreçlerine (Readme dosyaları vb.) titizlikle uyularak etkin bir takım koordinasyonu sağlanmıştır.</w:t>
+      </w:r>
+    </w:p>
+    <w:p>
+      <w:pPr>
+        <w:pStyle w:val="ResimYazs"/>
+        <w:keepNext/>
+        <w:ind w:left="2832" w:firstLine="708"/>
+      </w:pPr>
+      <w:r>
+        <w:t xml:space="preserve">Tablo </w:t>
+      </w:r>
+      <w:r>
+        <w:fldChar w:fldCharType="begin"/>
+      </w:r>
+      <w:r>
+        <w:instrText xml:space="preserve"> SEQ Tablo \* ARABIC </w:instrText>
+      </w:r>
+      <w:r>
+        <w:fldChar w:fldCharType="separate"/>
+      </w:r>
+      <w:r>
+        <w:t>1</w:t>
+      </w:r>
+      <w:r>
+        <w:fldChar w:fldCharType="end"/>
+      </w:r>
+      <w:r>
+        <w:t xml:space="preserve"> Görev Dağılımı</w:t>
+      </w:r>
+    </w:p>
+    <w:tbl>
+      <w:tblPr>
+        <w:tblStyle w:val="TabloKlavuzu"/>
+        <w:tblW w:w="0" w:type="auto"/>
+        <w:tblLook w:val="04A0" w:firstRow="1" w:lastRow="0" w:firstColumn="1" w:lastColumn="0" w:noHBand="0" w:noVBand="1"/>
+      </w:tblPr>
+      <w:tblGrid>
+        <w:gridCol w:w="4530"/>
+        <w:gridCol w:w="4530"/>
+      </w:tblGrid>
+      <w:tr>
+        <w:tc>
+          <w:tcPr>
+            <w:tcW w:w="4530" w:type="dxa"/>
+            <w:shd w:val="clear" w:color="auto" w:fill="E7E6E6" w:themeFill="background2"/>
+          </w:tcPr>
+          <w:p>
+            <w:pPr>
+              <w:spacing w:line="276" w:lineRule="auto"/>
+              <w:jc w:val="both"/>
+              <w:rPr>
+                <w:rFonts w:ascii="Courier New" w:hAnsi="Courier New" w:cs="Courier New"/>
+                <w:sz w:val="20"/>
+                <w:szCs w:val="20"/>
+              </w:rPr>
+            </w:pPr>
+            <w:r>
+              <w:rPr>
+                <w:rFonts w:ascii="Courier New" w:hAnsi="Courier New" w:cs="Courier New"/>
+                <w:sz w:val="20"/>
+                <w:szCs w:val="20"/>
+              </w:rPr>
+              <w:t>Takım Üyesi</w:t>
+            </w:r>
+          </w:p>
+        </w:tc>
+        <w:tc>
+          <w:tcPr>
+            <w:tcW w:w="4530" w:type="dxa"/>
+            <w:shd w:val="clear" w:color="auto" w:fill="E7E6E6" w:themeFill="background2"/>
+          </w:tcPr>
+          <w:p>
+            <w:pPr>
+              <w:spacing w:line="276" w:lineRule="auto"/>
+              <w:jc w:val="both"/>
+              <w:rPr>
+                <w:rFonts w:ascii="Courier New" w:hAnsi="Courier New" w:cs="Courier New"/>
+                <w:sz w:val="20"/>
+                <w:szCs w:val="20"/>
+              </w:rPr>
+            </w:pPr>
+            <w:r>
+              <w:rPr>
+                <w:rFonts w:ascii="Courier New" w:hAnsi="Courier New" w:cs="Courier New"/>
+                <w:sz w:val="20"/>
+                <w:szCs w:val="20"/>
+              </w:rPr>
+              <w:t>Takım Görevi</w:t>
+            </w:r>
+          </w:p>
+        </w:tc>
+      </w:tr>
+      <w:tr>
+        <w:tc>
+          <w:tcPr>
+            <w:tcW w:w="4530" w:type="dxa"/>
+          </w:tcPr>
+          <w:p>
+            <w:pPr>
+              <w:spacing w:line="276" w:lineRule="auto"/>
+              <w:jc w:val="both"/>
+              <w:rPr>
+                <w:rFonts w:ascii="Courier New" w:hAnsi="Courier New" w:cs="Courier New"/>
+                <w:sz w:val="20"/>
+                <w:szCs w:val="20"/>
+              </w:rPr>
+            </w:pPr>
+            <w:r>
+              <w:rPr>
+                <w:rFonts w:ascii="Courier New" w:hAnsi="Courier New" w:cs="Courier New"/>
+                <w:sz w:val="20"/>
+                <w:szCs w:val="20"/>
+              </w:rPr>
+              <w:t>Umutcan Yıldız</w:t>
+            </w:r>
+          </w:p>
+        </w:tc>
+        <w:tc>
+          <w:tcPr>
+            <w:tcW w:w="4530" w:type="dxa"/>
+          </w:tcPr>
+          <w:p>
+            <w:pPr>
+              <w:spacing w:line="276" w:lineRule="auto"/>
+              <w:jc w:val="both"/>
+              <w:rPr>
+                <w:rFonts w:ascii="Courier New" w:hAnsi="Courier New" w:cs="Courier New"/>
+                <w:sz w:val="20"/>
+                <w:szCs w:val="20"/>
+              </w:rPr>
+            </w:pPr>
+            <w:r>
+              <w:rPr>
+                <w:rFonts w:ascii="Courier New" w:hAnsi="Courier New" w:cs="Courier New"/>
+                <w:sz w:val="20"/>
+                <w:szCs w:val="20"/>
+              </w:rPr>
+              <w:t xml:space="preserve">Rapor, </w:t>
+            </w:r>
+            <w:r>
+              <w:rPr>
+                <w:rFonts w:ascii="Courier New" w:hAnsi="Courier New" w:cs="Courier New"/>
+                <w:sz w:val="20"/>
+                <w:szCs w:val="20"/>
+              </w:rPr>
+              <w:t>K</w:t>
+            </w:r>
+            <w:r>
+              <w:rPr>
+                <w:rFonts w:ascii="Courier New" w:hAnsi="Courier New" w:cs="Courier New"/>
+                <w:sz w:val="20"/>
+                <w:szCs w:val="20"/>
+              </w:rPr>
+              <w:t xml:space="preserve">od, </w:t>
+            </w:r>
+            <w:r>
+              <w:rPr>
+                <w:rFonts w:ascii="Courier New" w:hAnsi="Courier New" w:cs="Courier New"/>
+                <w:sz w:val="20"/>
+                <w:szCs w:val="20"/>
+              </w:rPr>
+              <w:t>A</w:t>
+            </w:r>
+            <w:r>
+              <w:rPr>
+                <w:rFonts w:ascii="Courier New" w:hAnsi="Courier New" w:cs="Courier New"/>
+                <w:sz w:val="20"/>
+                <w:szCs w:val="20"/>
+              </w:rPr>
+              <w:t xml:space="preserve">ssembly, </w:t>
+            </w:r>
+            <w:r>
+              <w:rPr>
+                <w:rFonts w:ascii="Courier New" w:hAnsi="Courier New" w:cs="Courier New"/>
+                <w:sz w:val="20"/>
+                <w:szCs w:val="20"/>
+              </w:rPr>
+              <w:t>L</w:t>
+            </w:r>
+            <w:r>
+              <w:rPr>
+                <w:rFonts w:ascii="Courier New" w:hAnsi="Courier New" w:cs="Courier New"/>
+                <w:sz w:val="20"/>
+                <w:szCs w:val="20"/>
+              </w:rPr>
+              <w:t>iteratür.</w:t>
+            </w:r>
+          </w:p>
+        </w:tc>
+      </w:tr>
+      <w:tr>
+        <w:tc>
+          <w:tcPr>
+            <w:tcW w:w="4530" w:type="dxa"/>
+          </w:tcPr>
+          <w:p>
+            <w:pPr>
+              <w:spacing w:line="276" w:lineRule="auto"/>
+              <w:jc w:val="both"/>
+              <w:rPr>
+                <w:rFonts w:ascii="Courier New" w:hAnsi="Courier New" w:cs="Courier New"/>
+                <w:sz w:val="20"/>
+                <w:szCs w:val="20"/>
+              </w:rPr>
+            </w:pPr>
+            <w:r>
+              <w:rPr>
+                <w:rFonts w:ascii="Courier New" w:hAnsi="Courier New" w:cs="Courier New"/>
+                <w:sz w:val="20"/>
+                <w:szCs w:val="20"/>
+              </w:rPr>
+              <w:t>Nihat Can Akkaya</w:t>
+            </w:r>
+          </w:p>
+        </w:tc>
+        <w:tc>
+          <w:tcPr>
+            <w:tcW w:w="4530" w:type="dxa"/>
+          </w:tcPr>
+          <w:p>
+            <w:pPr>
+              <w:spacing w:line="276" w:lineRule="auto"/>
+              <w:jc w:val="both"/>
+              <w:rPr>
+                <w:rFonts w:ascii="Courier New" w:hAnsi="Courier New" w:cs="Courier New"/>
+                <w:sz w:val="20"/>
+                <w:szCs w:val="20"/>
+              </w:rPr>
+            </w:pPr>
+            <w:r>
+              <w:rPr>
+                <w:rFonts w:ascii="Courier New" w:hAnsi="Courier New" w:cs="Courier New"/>
+                <w:sz w:val="20"/>
+                <w:szCs w:val="20"/>
+              </w:rPr>
+              <w:t xml:space="preserve">Rapor, </w:t>
+            </w:r>
+            <w:r>
+              <w:rPr>
+                <w:rFonts w:ascii="Courier New" w:hAnsi="Courier New" w:cs="Courier New"/>
+                <w:sz w:val="20"/>
+                <w:szCs w:val="20"/>
+              </w:rPr>
+              <w:t>K</w:t>
+            </w:r>
+            <w:r>
+              <w:rPr>
+                <w:rFonts w:ascii="Courier New" w:hAnsi="Courier New" w:cs="Courier New"/>
+                <w:sz w:val="20"/>
+                <w:szCs w:val="20"/>
+              </w:rPr>
+              <w:t xml:space="preserve">od, </w:t>
+            </w:r>
+            <w:r>
+              <w:rPr>
+                <w:rFonts w:ascii="Courier New" w:hAnsi="Courier New" w:cs="Courier New"/>
+                <w:sz w:val="20"/>
+                <w:szCs w:val="20"/>
+              </w:rPr>
+              <w:t>A</w:t>
+            </w:r>
+            <w:r>
+              <w:rPr>
+                <w:rFonts w:ascii="Courier New" w:hAnsi="Courier New" w:cs="Courier New"/>
+                <w:sz w:val="20"/>
+                <w:szCs w:val="20"/>
+              </w:rPr>
+              <w:t xml:space="preserve">ssembly, </w:t>
+            </w:r>
+            <w:r>
+              <w:rPr>
+                <w:rFonts w:ascii="Courier New" w:hAnsi="Courier New" w:cs="Courier New"/>
+                <w:sz w:val="20"/>
+                <w:szCs w:val="20"/>
+              </w:rPr>
+              <w:t>L</w:t>
+            </w:r>
+            <w:r>
+              <w:rPr>
+                <w:rFonts w:ascii="Courier New" w:hAnsi="Courier New" w:cs="Courier New"/>
+                <w:sz w:val="20"/>
+                <w:szCs w:val="20"/>
+              </w:rPr>
+              <w:t>iteratür.</w:t>
+            </w:r>
+          </w:p>
+        </w:tc>
+      </w:tr>
+      <w:tr>
+        <w:tc>
+          <w:tcPr>
+            <w:tcW w:w="4530" w:type="dxa"/>
+          </w:tcPr>
+          <w:p>
+            <w:pPr>
+              <w:spacing w:line="276" w:lineRule="auto"/>
+              <w:jc w:val="both"/>
+              <w:rPr>
+                <w:rFonts w:ascii="Courier New" w:hAnsi="Courier New" w:cs="Courier New"/>
+                <w:sz w:val="20"/>
+                <w:szCs w:val="20"/>
+              </w:rPr>
+            </w:pPr>
+            <w:r>
+              <w:rPr>
+                <w:rFonts w:ascii="Courier New" w:hAnsi="Courier New" w:cs="Courier New"/>
+                <w:sz w:val="20"/>
+                <w:szCs w:val="20"/>
+              </w:rPr>
+              <w:t>Süreyya Sönmez</w:t>
+            </w:r>
+          </w:p>
+        </w:tc>
+        <w:tc>
+          <w:tcPr>
+            <w:tcW w:w="4530" w:type="dxa"/>
+          </w:tcPr>
+          <w:p>
+            <w:pPr>
+              <w:spacing w:line="276" w:lineRule="auto"/>
+              <w:jc w:val="both"/>
+              <w:rPr>
+                <w:rFonts w:ascii="Courier New" w:hAnsi="Courier New" w:cs="Courier New"/>
+                <w:sz w:val="20"/>
+                <w:szCs w:val="20"/>
+              </w:rPr>
+            </w:pPr>
+            <w:r>
+              <w:rPr>
+                <w:rFonts w:ascii="Courier New" w:hAnsi="Courier New" w:cs="Courier New"/>
+                <w:sz w:val="20"/>
+                <w:szCs w:val="20"/>
+              </w:rPr>
+              <w:t xml:space="preserve">Rapor, </w:t>
+            </w:r>
+            <w:r>
+              <w:rPr>
+                <w:rFonts w:ascii="Courier New" w:hAnsi="Courier New" w:cs="Courier New"/>
+                <w:sz w:val="20"/>
+                <w:szCs w:val="20"/>
+              </w:rPr>
+              <w:t>K</w:t>
+            </w:r>
+            <w:r>
+              <w:rPr>
+                <w:rFonts w:ascii="Courier New" w:hAnsi="Courier New" w:cs="Courier New"/>
+                <w:sz w:val="20"/>
+                <w:szCs w:val="20"/>
+              </w:rPr>
+              <w:t xml:space="preserve">od, </w:t>
+            </w:r>
+            <w:r>
+              <w:rPr>
+                <w:rFonts w:ascii="Courier New" w:hAnsi="Courier New" w:cs="Courier New"/>
+                <w:sz w:val="20"/>
+                <w:szCs w:val="20"/>
+              </w:rPr>
+              <w:t>A</w:t>
+            </w:r>
+            <w:r>
+              <w:rPr>
+                <w:rFonts w:ascii="Courier New" w:hAnsi="Courier New" w:cs="Courier New"/>
+                <w:sz w:val="20"/>
+                <w:szCs w:val="20"/>
+              </w:rPr>
+              <w:t xml:space="preserve">ssembly, </w:t>
+            </w:r>
+            <w:r>
+              <w:rPr>
+                <w:rFonts w:ascii="Courier New" w:hAnsi="Courier New" w:cs="Courier New"/>
+                <w:sz w:val="20"/>
+                <w:szCs w:val="20"/>
+              </w:rPr>
+              <w:t>L</w:t>
+            </w:r>
+            <w:r>
+              <w:rPr>
+                <w:rFonts w:ascii="Courier New" w:hAnsi="Courier New" w:cs="Courier New"/>
+                <w:sz w:val="20"/>
+                <w:szCs w:val="20"/>
+              </w:rPr>
+              <w:t>iteratür.</w:t>
+            </w:r>
+          </w:p>
+        </w:tc>
+      </w:tr>
+      <w:tr>
+        <w:tc>
+          <w:tcPr>
+            <w:tcW w:w="4530" w:type="dxa"/>
+          </w:tcPr>
+          <w:p>
+            <w:pPr>
+              <w:spacing w:line="276" w:lineRule="auto"/>
+              <w:jc w:val="both"/>
+              <w:rPr>
+                <w:rFonts w:ascii="Courier New" w:hAnsi="Courier New" w:cs="Courier New"/>
+                <w:sz w:val="20"/>
+                <w:szCs w:val="20"/>
+              </w:rPr>
+            </w:pPr>
+            <w:r>
+              <w:rPr>
+                <w:rFonts w:ascii="Courier New" w:hAnsi="Courier New" w:cs="Courier New"/>
+                <w:sz w:val="20"/>
+                <w:szCs w:val="20"/>
+              </w:rPr>
+              <w:t>Enes Doğru</w:t>
+            </w:r>
+          </w:p>
+        </w:tc>
+        <w:tc>
+          <w:tcPr>
+            <w:tcW w:w="4530" w:type="dxa"/>
+          </w:tcPr>
+          <w:p>
+            <w:pPr>
+              <w:spacing w:line="276" w:lineRule="auto"/>
+              <w:jc w:val="both"/>
+              <w:rPr>
+                <w:rFonts w:ascii="Courier New" w:hAnsi="Courier New" w:cs="Courier New"/>
+                <w:sz w:val="20"/>
+                <w:szCs w:val="20"/>
+              </w:rPr>
+            </w:pPr>
+            <w:r>
+              <w:rPr>
+                <w:rFonts w:ascii="Courier New" w:hAnsi="Courier New" w:cs="Courier New"/>
+                <w:sz w:val="20"/>
+                <w:szCs w:val="20"/>
+              </w:rPr>
+              <w:t xml:space="preserve">Rapor, </w:t>
+            </w:r>
+            <w:r>
+              <w:rPr>
+                <w:rFonts w:ascii="Courier New" w:hAnsi="Courier New" w:cs="Courier New"/>
+                <w:sz w:val="20"/>
+                <w:szCs w:val="20"/>
+              </w:rPr>
+              <w:t>K</w:t>
+            </w:r>
+            <w:r>
+              <w:rPr>
+                <w:rFonts w:ascii="Courier New" w:hAnsi="Courier New" w:cs="Courier New"/>
+                <w:sz w:val="20"/>
+                <w:szCs w:val="20"/>
+              </w:rPr>
+              <w:t xml:space="preserve">od, </w:t>
+            </w:r>
+            <w:r>
+              <w:rPr>
+                <w:rFonts w:ascii="Courier New" w:hAnsi="Courier New" w:cs="Courier New"/>
+                <w:sz w:val="20"/>
+                <w:szCs w:val="20"/>
+              </w:rPr>
+              <w:t>A</w:t>
+            </w:r>
+            <w:r>
+              <w:rPr>
+                <w:rFonts w:ascii="Courier New" w:hAnsi="Courier New" w:cs="Courier New"/>
+                <w:sz w:val="20"/>
+                <w:szCs w:val="20"/>
+              </w:rPr>
+              <w:t xml:space="preserve">ssembly, </w:t>
+            </w:r>
+            <w:r>
+              <w:rPr>
+                <w:rFonts w:ascii="Courier New" w:hAnsi="Courier New" w:cs="Courier New"/>
+                <w:sz w:val="20"/>
+                <w:szCs w:val="20"/>
+              </w:rPr>
+              <w:t>L</w:t>
+            </w:r>
+            <w:r>
+              <w:rPr>
+                <w:rFonts w:ascii="Courier New" w:hAnsi="Courier New" w:cs="Courier New"/>
+                <w:sz w:val="20"/>
+                <w:szCs w:val="20"/>
+              </w:rPr>
+              <w:t>iteratür.</w:t>
+            </w:r>
+          </w:p>
+        </w:tc>
+      </w:tr>
+    </w:tbl>
+    <w:p>
+      <w:pPr>
+        <w:spacing w:line="276" w:lineRule="auto"/>
+        <w:jc w:val="both"/>
+        <w:rPr>
+          <w:rFonts w:ascii="Courier New" w:hAnsi="Courier New" w:cs="Courier New"/>
+          <w:sz w:val="20"/>
+          <w:szCs w:val="20"/>
+        </w:rPr>
+      </w:pPr>
+      <w:r>
+        <mc:AlternateContent>
+          <mc:Choice Requires="wps">
+            <w:drawing>
+              <wp:anchor distT="0" distB="0" distL="114300" distR="114300" simplePos="0" relativeHeight="251675648" behindDoc="0" locked="0" layoutInCell="1" allowOverlap="1" wp14:anchorId="417EEF0A" wp14:editId="18ECEAFE">
+                <wp:simplePos x="0" y="0"/>
+                <wp:positionH relativeFrom="column">
+                  <wp:posOffset>-849630</wp:posOffset>
+                </wp:positionH>
+                <wp:positionV relativeFrom="paragraph">
+                  <wp:posOffset>4018915</wp:posOffset>
+                </wp:positionV>
+                <wp:extent cx="7434580" cy="635"/>
+                <wp:effectExtent l="0" t="0" r="0" b="0"/>
+                <wp:wrapNone/>
+                <wp:docPr id="455992958" name="Metin Kutusu 1"/>
+                <wp:cNvGraphicFramePr/>
+                <a:graphic xmlns:a="http://schemas.openxmlformats.org/drawingml/2006/main">
+                  <a:graphicData uri="http://schemas.microsoft.com/office/word/2010/wordprocessingShape">
+                    <wps:wsp>
+                      <wps:cNvSpPr txBox="1"/>
+                      <wps:spPr>
+                        <a:xfrm>
+                          <a:off x="0" y="0"/>
+                          <a:ext cx="7434580" cy="635"/>
+                        </a:xfrm>
+                        <a:prstGeom prst="rect">
+                          <a:avLst/>
+                        </a:prstGeom>
+                        <a:solidFill>
+                          <a:prstClr val="white"/>
+                        </a:solidFill>
+                        <a:ln>
+                          <a:noFill/>
+                        </a:ln>
+                      </wps:spPr>
+                      <wps:txbx>
+                        <w:txbxContent>
+                          <w:p>
+                            <w:pPr>
+                              <w:pStyle w:val="ResimYazs"/>
+                              <w:spacing w:after="0"/>
+                              <w:jc w:val="center"/>
+                            </w:pPr>
+                            <w:r>
+                              <w:t xml:space="preserve">Şekil </w:t>
+                            </w:r>
+                            <w:r>
+                              <w:fldChar w:fldCharType="begin"/>
+                            </w:r>
+                            <w:r>
+                              <w:instrText xml:space="preserve"> SEQ Şekil \* ARABIC </w:instrText>
+                            </w:r>
+                            <w:r>
+                              <w:fldChar w:fldCharType="separate"/>
+                            </w:r>
+                            <w:r>
+                              <w:t>13</w:t>
+                            </w:r>
+                            <w:r>
+                              <w:fldChar w:fldCharType="end"/>
+                            </w:r>
+                            <w:r>
+                              <w:t xml:space="preserve"> Meet Toplantısı</w:t>
+                            </w:r>
+                          </w:p>
+                        </w:txbxContent>
+                      </wps:txbx>
+                      <wps:bodyPr rot="0" spcFirstLastPara="0" vertOverflow="overflow" horzOverflow="overflow" vert="horz" wrap="square" lIns="0" tIns="0" rIns="0" bIns="0" numCol="1" spcCol="0" rtlCol="0" fromWordArt="0" anchor="t" anchorCtr="0" forceAA="0" compatLnSpc="1">
+                        <a:prstTxWarp prst="textNoShape">
+                          <a:avLst/>
+                        </a:prstTxWarp>
+                        <a:spAutoFit/>
+                      </wps:bodyPr>
+                    </wps:wsp>
+                  </a:graphicData>
+                </a:graphic>
+              </wp:anchor>
+            </w:drawing>
+          </mc:Choice>
+          <mc:Fallback>
+            <w:pict>
+              <v:shapetype w14:anchorId="417EEF0A" id="_x0000_t202" coordsize="21600,21600" o:spt="202" path="m,l,21600r21600,l21600,xe">
+                <v:stroke joinstyle="miter"/>
+                <v:path gradientshapeok="t" o:connecttype="rect"/>
+              </v:shapetype>
+              <v:shape id="_x0000_s1032" type="#_x0000_t202" style="position:absolute;left:0;text-align:left;margin-left:-66.9pt;margin-top:316.45pt;width:585.4pt;height:.05pt;z-index:251675648;visibility:visible;mso-wrap-style:square;mso-wrap-distance-left:9pt;mso-wrap-distance-top:0;mso-wrap-distance-right:9pt;mso-wrap-distance-bottom:0;mso-position-horizontal:absolute;mso-position-horizontal-relative:text;mso-position-vertical:absolute;mso-position-vertical-relative:text;v-text-anchor:top" o:gfxdata="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" stroked="f">
+                <v:textbox style="mso-fit-shape-to-text:t" inset="0,0,0,0">
+                  <w:txbxContent>
+                    <w:p>
+                      <w:pPr>
+                        <w:pStyle w:val="ResimYazs"/>
+                        <w:spacing w:after="0"/>
+                        <w:jc w:val="center"/>
+                      </w:pPr>
+                      <w:r>
+                        <w:t xml:space="preserve">Şekil </w:t>
+                      </w:r>
+                      <w:r>
+                        <w:fldChar w:fldCharType="begin"/>
+                      </w:r>
+                      <w:r>
+                        <w:instrText xml:space="preserve"> SEQ Şekil \* ARABIC </w:instrText>
+                      </w:r>
+                      <w:r>
+                        <w:fldChar w:fldCharType="separate"/>
+                      </w:r>
+                      <w:r>
+                        <w:t>13</w:t>
+                      </w:r>
+                      <w:r>
+                        <w:fldChar w:fldCharType="end"/>
+                      </w:r>
+                      <w:r>
+                        <w:t xml:space="preserve"> Meet Toplantısı</w:t>
+                      </w:r>
+                    </w:p>
+                  </w:txbxContent>
+                </v:textbox>
+              </v:shape>
+            </w:pict>
+          </mc:Fallback>
+        </mc:AlternateContent>
+      </w:r>
+    </w:p>
+    <w:p>
+      <w:r>
+        <w:drawing>
+          <wp:anchor distT="0" distB="0" distL="114300" distR="114300" simplePos="0" relativeHeight="251671552" behindDoc="0" locked="0" layoutInCell="1" allowOverlap="1" wp14:anchorId="4A864875" wp14:editId="5E735001">
+            <wp:simplePos x="0" y="0"/>
+            <wp:positionH relativeFrom="column">
+              <wp:posOffset>-189018</wp:posOffset>
+            </wp:positionH>
+            <wp:positionV relativeFrom="paragraph">
+              <wp:posOffset>83609</wp:posOffset>
+            </wp:positionV>
+            <wp:extent cx="6113292" cy="3056042"/>
+            <wp:effectExtent l="0" t="0" r="1905" b="0"/>
+            <wp:wrapNone/>
+            <wp:docPr id="233997158" name="Resim 6"/>
+            <wp:cNvGraphicFramePr>
+              <a:graphicFrameLocks xmlns:a="http://schemas.openxmlformats.org/drawingml/2006/main" noChangeAspect="1"/>
+            </wp:cNvGraphicFramePr>
+            <a:graphic xmlns:a="http://schemas.openxmlformats.org/drawingml/2006/main">
+              <a:graphicData uri="http://schemas.openxmlformats.org/drawingml/2006/picture">
+                <pic:pic xmlns:pic="http://schemas.openxmlformats.org/drawingml/2006/picture">
+                  <pic:nvPicPr>
+                    <pic:cNvPr id="233997158" name="Resim 233997158"/>
+                    <pic:cNvPicPr/>
+                  </pic:nvPicPr>
+                  <pic:blipFill rotWithShape="1">
+                    <a:blip r:embed="rId21" cstate="print">
+                      <a:extLst>
+                        <a:ext uri="{28A0092B-C50C-407E-A947-70E740481C1C}">
+                          <a14:useLocalDpi xmlns:a14="http://schemas.microsoft.com/office/drawing/2010/main" val="0"/>
+                        </a:ext>
+                      </a:extLst>
+                    </a:blip>
+                    <a:srcRect b="11133"/>
+                    <a:stretch>
+                      <a:fillRect/>
+                    </a:stretch>
+                  </pic:blipFill>
+                  <pic:spPr bwMode="auto">
+                    <a:xfrm>
+                      <a:off x="0" y="0"/>
+                      <a:ext cx="6113292" cy="3056042"/>
+                    </a:xfrm>
+                    <a:prstGeom prst="rect">
+                      <a:avLst/>
+                    </a:prstGeom>
+                    <a:ln>
+                      <a:noFill/>
+                    </a:ln>
+                    <a:extLst>
+                      <a:ext uri="{53640926-AAD7-44D8-BBD7-CCE9431645EC}">
+                        <a14:shadowObscured xmlns:a14="http://schemas.microsoft.com/office/drawing/2010/main"/>
+                      </a:ext>
+                    </a:extLst>
+                  </pic:spPr>
+                </pic:pic>
+              </a:graphicData>
+            </a:graphic>
+            <wp14:sizeRelH relativeFrom="margin">
+              <wp14:pctWidth>0</wp14:pctWidth>
+            </wp14:sizeRelH>
+            <wp14:sizeRelV relativeFrom="margin">
+              <wp14:pctHeight>0</wp14:pctHeight>
+            </wp14:sizeRelV>
+          </wp:anchor>
+        </w:drawing>
+      </w:r>
+    </w:p>
+    <w:p/>
+    <w:p/>
+    <w:p/>
+    <w:p/>
+    <w:p/>
+    <w:p/>
+    <w:p>
+      <w:pPr>
+        <w:pStyle w:val="Balk1"/>
         <w:rPr>
           <w:rFonts w:ascii="Courier New" w:eastAsiaTheme="minorHAnsi" w:hAnsi="Courier New" w:cs="Courier New"/>
           <w:b/>
@@ -5612,9 +6777,20 @@
           <w:sz w:val="24"/>
           <w:szCs w:val="24"/>
         </w:rPr>
-        <w:t>.3. Takım Çalışması ve Proje Yönetimi</w:t>
-      </w:r>
-      <w:r>
+      </w:pPr>
+    </w:p>
+    <w:p/>
+    <w:p>
+      <w:bookmarkStart w:id="19" w:name="_Toc226123592"/>
+    </w:p>
+    <w:p/>
+    <w:p/>
+    <w:p/>
+    <w:p/>
+    <w:p/>
+    <w:p>
+      <w:pPr>
+        <w:pStyle w:val="Balk1"/>
         <w:rPr>
           <w:rFonts w:ascii="Courier New" w:eastAsiaTheme="minorHAnsi" w:hAnsi="Courier New" w:cs="Courier New"/>
           <w:b/>
@@ -5623,8 +6799,7 @@
           <w:sz w:val="24"/>
           <w:szCs w:val="24"/>
         </w:rPr>
-        <w:t xml:space="preserve"> </w:t>
-      </w:r>
+      </w:pPr>
       <w:r>
         <w:rPr>
           <w:rFonts w:ascii="Courier New" w:eastAsiaTheme="minorHAnsi" w:hAnsi="Courier New" w:cs="Courier New"/>
@@ -5634,7 +6809,8 @@
           <w:sz w:val="24"/>
           <w:szCs w:val="24"/>
         </w:rPr>
-        <w:t>(PÇ</w:t>
+        <w:lastRenderedPageBreak/>
+        <w:t>9</w:t>
       </w:r>
       <w:r>
         <w:rPr>
@@ -5645,7 +6821,7 @@
           <w:sz w:val="24"/>
           <w:szCs w:val="24"/>
         </w:rPr>
-        <w:t xml:space="preserve">12 – </w:t>
+        <w:t xml:space="preserve">. </w:t>
       </w:r>
       <w:r>
         <w:rPr>
@@ -5656,35 +6832,12 @@
           <w:sz w:val="24"/>
           <w:szCs w:val="24"/>
         </w:rPr>
-        <w:t>PÇ</w:t>
-      </w:r>
-      <w:r>
-        <w:rPr>
-          <w:rFonts w:ascii="Courier New" w:eastAsiaTheme="minorHAnsi" w:hAnsi="Courier New" w:cs="Courier New"/>
-          <w:b/>
-          <w:bCs/>
-          <w:color w:val="auto"/>
-          <w:sz w:val="24"/>
-          <w:szCs w:val="24"/>
-        </w:rPr>
-        <w:t>13</w:t>
-      </w:r>
-      <w:r>
-        <w:rPr>
-          <w:rFonts w:ascii="Courier New" w:eastAsiaTheme="minorHAnsi" w:hAnsi="Courier New" w:cs="Courier New"/>
-          <w:b/>
-          <w:bCs/>
-          <w:color w:val="auto"/>
-          <w:sz w:val="24"/>
-          <w:szCs w:val="24"/>
-        </w:rPr>
-        <w:t>)</w:t>
-      </w:r>
-      <w:bookmarkEnd w:id="18"/>
-    </w:p>
-    <w:p>
-      <w:pPr>
-        <w:spacing w:line="276" w:lineRule="auto"/>
+        <w:t>KAYNAKÇA</w:t>
+      </w:r>
+      <w:bookmarkEnd w:id="19"/>
+    </w:p>
+    <w:p>
+      <w:pPr>
         <w:jc w:val="both"/>
         <w:rPr>
           <w:rFonts w:ascii="Courier New" w:hAnsi="Courier New" w:cs="Courier New"/>
@@ -5698,12 +6851,11 @@
           <w:sz w:val="20"/>
           <w:szCs w:val="20"/>
         </w:rPr>
-        <w:t>Projenin geliştirilme süreci, yazılım mühendisliği prensiplerine uygun olarak modüler bir iş bölümü ile yürütülmüştür. Assembler'ın mimarisi; ayrıştırıcı (Parser), kod üretici (Code Generator) ve veri yöneticisi (Symbol ve Opcode Tables) olmak üzere bağımsız sınıflara ayrılmıştır. Bu modüler yaklaşım, proje bileşenlerinin eşzamanlı olarak geliştirilmesine, test edilmesine ve hata ayıklama (debugging) süreçlerinin kolaylaşmasına olanak tanımıştır. Ayrıca kod versiyonlama ve dokümantasyon süreçlerine (Readme dosyaları vb.) titizlikle uyularak etkin bir takım koordinasyonu sağlanmıştır.</w:t>
-      </w:r>
-    </w:p>
-    <w:p>
-      <w:pPr>
-        <w:spacing w:line="276" w:lineRule="auto"/>
+        <w:t>[1] Leland L. Beck, "System Software: An Introduction to Systems Programming", 3. Baskı, Bölüm 2: Assemblers (İki Geçişli Mimari Algoritmaları), s. 44-55.</w:t>
+      </w:r>
+    </w:p>
+    <w:p>
+      <w:pPr>
         <w:jc w:val="both"/>
         <w:rPr>
           <w:rFonts w:ascii="Courier New" w:hAnsi="Courier New" w:cs="Courier New"/>
@@ -5711,59 +6863,14 @@
           <w:szCs w:val="20"/>
         </w:rPr>
       </w:pPr>
-    </w:p>
-    <w:p/>
-    <w:p/>
-    <w:p/>
-    <w:p/>
-    <w:p>
-      <w:pPr>
-        <w:pStyle w:val="Balk1"/>
-        <w:rPr>
-          <w:rFonts w:ascii="Courier New" w:eastAsiaTheme="minorHAnsi" w:hAnsi="Courier New" w:cs="Courier New"/>
-          <w:b/>
-          <w:bCs/>
-          <w:color w:val="auto"/>
-          <w:sz w:val="24"/>
-          <w:szCs w:val="24"/>
-        </w:rPr>
-      </w:pPr>
-      <w:bookmarkStart w:id="19" w:name="_Toc226046778"/>
-      <w:r>
-        <w:rPr>
-          <w:rFonts w:ascii="Courier New" w:eastAsiaTheme="minorHAnsi" w:hAnsi="Courier New" w:cs="Courier New"/>
-          <w:b/>
-          <w:bCs/>
-          <w:color w:val="auto"/>
-          <w:sz w:val="24"/>
-          <w:szCs w:val="24"/>
-        </w:rPr>
-        <w:lastRenderedPageBreak/>
-        <w:t>9</w:t>
-      </w:r>
-      <w:r>
-        <w:rPr>
-          <w:rFonts w:ascii="Courier New" w:eastAsiaTheme="minorHAnsi" w:hAnsi="Courier New" w:cs="Courier New"/>
-          <w:b/>
-          <w:bCs/>
-          <w:color w:val="auto"/>
-          <w:sz w:val="24"/>
-          <w:szCs w:val="24"/>
-        </w:rPr>
-        <w:t xml:space="preserve">. </w:t>
-      </w:r>
-      <w:r>
-        <w:rPr>
-          <w:rFonts w:ascii="Courier New" w:eastAsiaTheme="minorHAnsi" w:hAnsi="Courier New" w:cs="Courier New"/>
-          <w:b/>
-          <w:bCs/>
-          <w:color w:val="auto"/>
-          <w:sz w:val="24"/>
-          <w:szCs w:val="24"/>
-        </w:rPr>
-        <w:t>KAYNAKÇA</w:t>
-      </w:r>
-      <w:bookmarkEnd w:id="19"/>
+      <w:r>
+        <w:rPr>
+          <w:rFonts w:ascii="Courier New" w:hAnsi="Courier New" w:cs="Courier New"/>
+          <w:sz w:val="20"/>
+          <w:szCs w:val="20"/>
+        </w:rPr>
+        <w:t>[2] T. H. Cormen vd., "Introduction to Algorithms", 3. Baskı, Bölüm 3: Growth of Functions (Asimptotik Büyüme ve Big-O Analizi), s. 43-50.</w:t>
+      </w:r>
     </w:p>
     <w:p>
       <w:pPr>
@@ -5780,7 +6887,7 @@
           <w:sz w:val="20"/>
           <w:szCs w:val="20"/>
         </w:rPr>
-        <w:t>[1] Leland L. Beck, "System Software: An Introduction to Systems Programming", 3. Baskı, Bölüm 2: Assemblers (İki Geçişli Mimari Algoritmaları), s. 44-55.</w:t>
+        <w:t>[3] RISC-V International, "The RISC-V Instruction Set Manual, Volume I: Unprivileged ISA", Bölüm 2: RV32I Base Integer Instruction Set.</w:t>
       </w:r>
     </w:p>
     <w:p>
@@ -5798,42 +6905,6 @@
           <w:sz w:val="20"/>
           <w:szCs w:val="20"/>
         </w:rPr>
-        <w:t>[2] T. H. Cormen vd., "Introduction to Algorithms", 3. Baskı, Bölüm 3: Growth of Functions (Asimptotik Büyüme ve Big-O Analizi), s. 43-50.</w:t>
-      </w:r>
-    </w:p>
-    <w:p>
-      <w:pPr>
-        <w:jc w:val="both"/>
-        <w:rPr>
-          <w:rFonts w:ascii="Courier New" w:hAnsi="Courier New" w:cs="Courier New"/>
-          <w:sz w:val="20"/>
-          <w:szCs w:val="20"/>
-        </w:rPr>
-      </w:pPr>
-      <w:r>
-        <w:rPr>
-          <w:rFonts w:ascii="Courier New" w:hAnsi="Courier New" w:cs="Courier New"/>
-          <w:sz w:val="20"/>
-          <w:szCs w:val="20"/>
-        </w:rPr>
-        <w:t>[3] RISC-V International, "The RISC-V Instruction Set Manual, Volume I: Unprivileged ISA", Bölüm 2: RV32I Base Integer Instruction Set.</w:t>
-      </w:r>
-    </w:p>
-    <w:p>
-      <w:pPr>
-        <w:jc w:val="both"/>
-        <w:rPr>
-          <w:rFonts w:ascii="Courier New" w:hAnsi="Courier New" w:cs="Courier New"/>
-          <w:sz w:val="20"/>
-          <w:szCs w:val="20"/>
-        </w:rPr>
-      </w:pPr>
-      <w:r>
-        <w:rPr>
-          <w:rFonts w:ascii="Courier New" w:hAnsi="Courier New" w:cs="Courier New"/>
-          <w:sz w:val="20"/>
-          <w:szCs w:val="20"/>
-        </w:rPr>
         <w:t>[4] M. T. Goodrich vd., "Data Structures and Algorithms in C++", 2. Baskı, Bölüm 9: Maps, Hash Tables and Skip Lists (O(1) Karmaşıklık Analizi), s. 382-395.</w:t>
       </w:r>
     </w:p>
@@ -5869,7 +6940,7 @@
         </w:rPr>
         <w:t xml:space="preserve">] Venus: Web-based RISC-V Simulator, University of California, Berkeley. Çapraz doğrulama ve mimari referans testleri için kullanılmıştır. Erişim adresi: </w:t>
       </w:r>
-      <w:hyperlink r:id="rId21" w:history="1">
+      <w:hyperlink r:id="rId22" w:history="1">
         <w:r>
           <w:rPr>
             <w:rStyle w:val="Kpr"/>
@@ -5908,7 +6979,7 @@
       </w:r>
     </w:p>
     <w:p>
-      <w:hyperlink r:id="rId22" w:history="1">
+      <w:hyperlink r:id="rId23" w:history="1">
         <w:r>
           <w:rPr>
             <w:rFonts w:ascii="Courier New" w:hAnsi="Courier New" w:cs="Courier New"/>
@@ -5972,25 +7043,16 @@
         </w:rPr>
         <w:t xml:space="preserve">Github Açık Kaynak Two-Pass Assembler Örnekleri. Erişim Adresleri: </w:t>
       </w:r>
-      <w:hyperlink r:id="rId23" w:tgtFrame="_blank" w:history="1">
-        <w:r>
-          <w:rPr>
-            <w:rStyle w:val="Kpr"/>
-            <w:rFonts w:ascii="Courier New" w:hAnsi="Courier New" w:cs="Courier New"/>
-            <w:sz w:val="20"/>
-            <w:szCs w:val="20"/>
-          </w:rPr>
-          <w:t>https://github.com/vxvaibhavxv/Two-Pass-Assembler</w:t>
-        </w:r>
-      </w:hyperlink>
-      <w:r>
-        <w:rPr>
-          <w:rFonts w:ascii="Courier New" w:hAnsi="Courier New" w:cs="Courier New"/>
-          <w:sz w:val="20"/>
-          <w:szCs w:val="20"/>
-        </w:rPr>
-        <w:t xml:space="preserve"> </w:t>
-      </w:r>
+    </w:p>
+    <w:p>
+      <w:pPr>
+        <w:jc w:val="both"/>
+        <w:rPr>
+          <w:rFonts w:ascii="Courier New" w:hAnsi="Courier New" w:cs="Courier New"/>
+          <w:sz w:val="20"/>
+          <w:szCs w:val="20"/>
+        </w:rPr>
+      </w:pPr>
       <w:hyperlink r:id="rId24" w:history="1">
         <w:r>
           <w:rPr>
@@ -6002,6 +7064,27 @@
           <w:t>https://github.com/ayushoriginal/Two-pass-Assembler</w:t>
         </w:r>
       </w:hyperlink>
+    </w:p>
+    <w:p>
+      <w:pPr>
+        <w:jc w:val="both"/>
+        <w:rPr>
+          <w:rFonts w:ascii="Courier New" w:hAnsi="Courier New" w:cs="Courier New"/>
+          <w:sz w:val="20"/>
+          <w:szCs w:val="20"/>
+        </w:rPr>
+      </w:pPr>
+      <w:hyperlink r:id="rId25" w:tgtFrame="_blank" w:history="1">
+        <w:r>
+          <w:rPr>
+            <w:rStyle w:val="Kpr"/>
+            <w:rFonts w:ascii="Courier New" w:hAnsi="Courier New" w:cs="Courier New"/>
+            <w:sz w:val="20"/>
+            <w:szCs w:val="20"/>
+          </w:rPr>
+          <w:t>https://github.com/vxvaibhavxv/Two-Pass-Assembler</w:t>
+        </w:r>
+      </w:hyperlink>
       <w:r>
         <w:rPr>
           <w:rFonts w:ascii="Courier New" w:hAnsi="Courier New" w:cs="Courier New"/>
@@ -6011,22 +7094,127 @@
         <w:t xml:space="preserve"> </w:t>
       </w:r>
     </w:p>
+    <w:p>
+      <w:pPr>
+        <w:jc w:val="both"/>
+        <w:rPr>
+          <w:rFonts w:ascii="Courier New" w:hAnsi="Courier New" w:cs="Courier New"/>
+          <w:sz w:val="20"/>
+          <w:szCs w:val="20"/>
+        </w:rPr>
+      </w:pPr>
+    </w:p>
+    <w:p>
+      <w:pPr>
+        <w:jc w:val="both"/>
+        <w:rPr>
+          <w:rFonts w:ascii="Courier New" w:hAnsi="Courier New" w:cs="Courier New"/>
+          <w:sz w:val="20"/>
+          <w:szCs w:val="20"/>
+        </w:rPr>
+      </w:pPr>
+    </w:p>
+    <w:p>
+      <w:pPr>
+        <w:jc w:val="both"/>
+        <w:rPr>
+          <w:rFonts w:ascii="Courier New" w:hAnsi="Courier New" w:cs="Courier New"/>
+          <w:sz w:val="20"/>
+          <w:szCs w:val="20"/>
+        </w:rPr>
+      </w:pPr>
+    </w:p>
+    <w:p>
+      <w:pPr>
+        <w:jc w:val="both"/>
+        <w:rPr>
+          <w:rFonts w:ascii="Courier New" w:hAnsi="Courier New" w:cs="Courier New"/>
+          <w:sz w:val="20"/>
+          <w:szCs w:val="20"/>
+        </w:rPr>
+      </w:pPr>
+    </w:p>
+    <w:p>
+      <w:pPr>
+        <w:jc w:val="both"/>
+        <w:rPr>
+          <w:rFonts w:ascii="Courier New" w:hAnsi="Courier New" w:cs="Courier New"/>
+          <w:sz w:val="20"/>
+          <w:szCs w:val="20"/>
+        </w:rPr>
+      </w:pPr>
+    </w:p>
+    <w:p>
+      <w:pPr>
+        <w:jc w:val="both"/>
+        <w:rPr>
+          <w:rFonts w:ascii="Courier New" w:hAnsi="Courier New" w:cs="Courier New"/>
+          <w:sz w:val="20"/>
+          <w:szCs w:val="20"/>
+        </w:rPr>
+      </w:pPr>
+    </w:p>
+    <w:p>
+      <w:pPr>
+        <w:jc w:val="both"/>
+        <w:rPr>
+          <w:rFonts w:ascii="Courier New" w:hAnsi="Courier New" w:cs="Courier New"/>
+          <w:sz w:val="20"/>
+          <w:szCs w:val="20"/>
+        </w:rPr>
+      </w:pPr>
+    </w:p>
+    <w:p>
+      <w:pPr>
+        <w:jc w:val="both"/>
+        <w:rPr>
+          <w:rFonts w:ascii="Courier New" w:hAnsi="Courier New" w:cs="Courier New"/>
+          <w:sz w:val="20"/>
+          <w:szCs w:val="20"/>
+        </w:rPr>
+      </w:pPr>
+    </w:p>
+    <w:p>
+      <w:pPr>
+        <w:jc w:val="both"/>
+        <w:rPr>
+          <w:rFonts w:ascii="Courier New" w:hAnsi="Courier New" w:cs="Courier New"/>
+          <w:sz w:val="20"/>
+          <w:szCs w:val="20"/>
+        </w:rPr>
+      </w:pPr>
+    </w:p>
+    <w:p>
+      <w:pPr>
+        <w:jc w:val="both"/>
+        <w:rPr>
+          <w:rFonts w:ascii="Courier New" w:hAnsi="Courier New" w:cs="Courier New"/>
+          <w:sz w:val="20"/>
+          <w:szCs w:val="20"/>
+        </w:rPr>
+      </w:pPr>
+    </w:p>
+    <w:p>
+      <w:pPr>
+        <w:jc w:val="both"/>
+        <w:rPr>
+          <w:rFonts w:ascii="Courier New" w:hAnsi="Courier New" w:cs="Courier New"/>
+          <w:sz w:val="20"/>
+          <w:szCs w:val="20"/>
+        </w:rPr>
+      </w:pPr>
+    </w:p>
+    <w:p>
+      <w:pPr>
+        <w:jc w:val="both"/>
+        <w:rPr>
+          <w:rFonts w:ascii="Courier New" w:hAnsi="Courier New" w:cs="Courier New"/>
+          <w:sz w:val="20"/>
+          <w:szCs w:val="20"/>
+        </w:rPr>
+      </w:pPr>
+    </w:p>
     <w:p/>
-    <w:p/>
-    <w:p/>
-    <w:p/>
-    <w:p/>
-    <w:p/>
-    <w:p/>
-    <w:p/>
-    <w:p/>
-    <w:p/>
-    <w:p/>
-    <w:p>
-      <w:pPr>
-        <w:ind w:left="360"/>
-      </w:pPr>
-    </w:p>
     <w:p/>
     <w:p>
       <w:r>
@@ -6055,7 +7243,7 @@
                     <pic:cNvPicPr/>
                   </pic:nvPicPr>
                   <pic:blipFill>
-                    <a:blip r:embed="rId25">
+                    <a:blip r:embed="rId26">
                       <a:extLst>
                         <a:ext uri="{28A0092B-C50C-407E-A947-70E740481C1C}">
                           <a14:useLocalDpi xmlns:a14="http://schemas.microsoft.com/office/drawing/2010/main" val="0"/>
@@ -11653,6 +12841,25 @@
       </w:tblBorders>
     </w:tblPr>
   </w:style>
+  <w:style w:type="paragraph" w:styleId="ResimYazs">
+    <w:name w:val="caption"/>
+    <w:basedOn w:val="Normal"/>
+    <w:next w:val="Normal"/>
+    <w:uiPriority w:val="35"/>
+    <w:unhideWhenUsed/>
+    <w:qFormat/>
+    <w:rsid w:val="008545AF"/>
+    <w:pPr>
+      <w:spacing w:after="200" w:line="240" w:lineRule="auto"/>
+    </w:pPr>
+    <w:rPr>
+      <w:i/>
+      <w:iCs/>
+      <w:color w:val="44546A" w:themeColor="text2"/>
+      <w:sz w:val="18"/>
+      <w:szCs w:val="18"/>
+    </w:rPr>
+  </w:style>
 </w:styles>
 </file>
 

</xml_diff>